<commit_message>
v172b: §8.10 Inspectorate Minimum Funding Guarantee restored + glossary/diagram fixes
Constitutional addition:
- §8.10 Inspectorate Minimum Funding Guarantee (restored) — annual appropriation
  for each Inspectorate may not fall below prior year without 2/3 vote of both chambers;
  MA certifies the floor annually and publishes to NRS before budget process

Glossary fixes:
- §19.3.g dead ref corrected to §19.3
- RSA Technical Integrity Commission entry added (§9.3.a–§9.3.g)

Diagram fixes:
- §1.29.d → §1.30.d (Intelligence Firewall — Article I renumbering)
- §6.4.c.i → §6.4.c (Asylum Court — no sub-provision exists)
- §8.10 now valid again (provision restored)

All 53 scenarios, glossary, diagrams, and advisor verified clean against v172
</commit_message>
<xml_diff>
--- a/constitution-v172.docx
+++ b/constitution-v172.docx
@@ -13115,6 +13115,50 @@
           <w:szCs w:val="22"/>
         </w:rPr>
         <w:t xml:space="preserve">Panel members receive no compensation for pool membership. Members receive service-day compensation for each day of active service during a constituted proceeding, from the date of acceptance through the date of finding publication. Rates and any remote service equivalencies are set by statute. The member's State pays the service-day compensation; the federal government reimburses each State for compensation paid to its drawn member. Service-day records and compensation amounts are published to the NRS alongside each Panel finding.</w:t>
+      </w:r>
+    </w:p>
+    <w:p>
+      <w:pPr>
+        <w:spacing w:after="60" w:before="200"/>
+        <w:ind w:left="431"/>
+      </w:pPr>
+      <w:r>
+        <w:rPr>
+          <w:rFonts w:ascii="Courier New" w:cs="Courier New" w:eastAsia="Courier New" w:hAnsi="Courier New"/>
+          <w:b/>
+          <w:bCs/>
+          <w:color w:val="1B2A4A"/>
+          <w:sz w:val="18"/>
+          <w:szCs w:val="18"/>
+        </w:rPr>
+        <w:t xml:space="preserve">§8.10  </w:t>
+      </w:r>
+      <w:r>
+        <w:rPr>
+          <w:rFonts w:ascii="Garamond" w:cs="Garamond" w:eastAsia="Garamond" w:hAnsi="Garamond"/>
+          <w:b/>
+          <w:bCs/>
+          <w:color w:val="1B2A4A"/>
+          <w:sz w:val="22"/>
+          <w:szCs w:val="22"/>
+        </w:rPr>
+        <w:t xml:space="preserve">Inspectorate Minimum Funding Guarantee</w:t>
+      </w:r>
+    </w:p>
+    <w:p>
+      <w:pPr>
+        <w:spacing w:after="120" w:before="0"/>
+        <w:ind w:left="431"/>
+        <w:jc w:val="both"/>
+      </w:pPr>
+      <w:r>
+        <w:rPr>
+          <w:rFonts w:ascii="Garamond" w:cs="Garamond" w:eastAsia="Garamond" w:hAnsi="Garamond"/>
+          <w:color w:val="2a2520"/>
+          <w:sz w:val="22"/>
+          <w:szCs w:val="22"/>
+        </w:rPr>
+        <w:t xml:space="preserve">The annual appropriation for each Inspectorate may not fall below the prior fiscal year's funding level without a 2/3 vote of both chambers simultaneously. This floor ensures that Inspectorate independence cannot be undermined through budgetary attrition by the branches they audit. The Monetary Authority certifies each Inspectorate's prior-year funding level annually and publishes the certified floor to the NRS before the Legislature begins its annual budget process.</w:t>
       </w:r>
     </w:p>
     <w:p>

</xml_diff>

<commit_message>
v172c: add 40 missing parent provisions — annotated page ordering fixed
Every section with sub-provisions now has a proper constitutional parent.
Previously 40 section parents were absent, causing articles to start
mid-section (e.g. §3.1.a instead of §3.1, §18.1.a instead of §18.1).

Parents added across all 20 articles:
Art I:  §1.14 §1.15 §1.16 §1.19 §1.26
Art II: §2.3 §2.4 §2.5 §2.9
Art III: §3.1 §3.3 §3.6 §3.7
Art IV: §4.4
Art V:  §5.1 §5.5
Art VII: §7.2 §7.3
Art VIII: §8.3 §8.4 §8.5 §8.6
Art IX: §9.5
Art X:  §10.4 §10.5 §10.6
Art XI: §11.2
Art XII: §12.5
Art XIV: §14.3 §14.4 §14.5
Art XV: §15.3 §15.4
Art XVI: §16.4 §16.5
Art XVII: §17.3
Art XVIII: §18.1 §18.2 §18.3
Art XIX: §19.7

Total provisions: 557 (was 517)
All article sections now start at their parent provision number
</commit_message>
<xml_diff>
--- a/constitution-v172.docx
+++ b/constitution-v172.docx
@@ -1206,6 +1206,50 @@
     <w:p>
       <w:pPr>
         <w:spacing w:after="60" w:before="200"/>
+        <w:ind w:left="431"/>
+      </w:pPr>
+      <w:r>
+        <w:rPr>
+          <w:rFonts w:ascii="Courier New" w:cs="Courier New" w:eastAsia="Courier New" w:hAnsi="Courier New"/>
+          <w:b/>
+          <w:bCs/>
+          <w:color w:val="1B2A4A"/>
+          <w:sz w:val="18"/>
+          <w:szCs w:val="18"/>
+        </w:rPr>
+        <w:t xml:space="preserve">§1.14  </w:t>
+      </w:r>
+      <w:r>
+        <w:rPr>
+          <w:rFonts w:ascii="Garamond" w:cs="Garamond" w:eastAsia="Garamond" w:hAnsi="Garamond"/>
+          <w:b/>
+          <w:bCs/>
+          <w:color w:val="1B2A4A"/>
+          <w:sz w:val="22"/>
+          <w:szCs w:val="22"/>
+        </w:rPr>
+        <w:t xml:space="preserve">Detention and Habeas Corpus Rights</w:t>
+      </w:r>
+    </w:p>
+    <w:p>
+      <w:pPr>
+        <w:spacing w:after="120" w:before="0"/>
+        <w:ind w:left="431"/>
+        <w:jc w:val="both"/>
+      </w:pPr>
+      <w:r>
+        <w:rPr>
+          <w:rFonts w:ascii="Garamond" w:cs="Garamond" w:eastAsia="Garamond" w:hAnsi="Garamond"/>
+          <w:color w:val="2a2520"/>
+          <w:sz w:val="22"/>
+          <w:szCs w:val="22"/>
+        </w:rPr>
+        <w:t xml:space="preserve">Any person taken into custody by the State holds the rights established in this section. These rights are self-executing and may not be suspended by statute or executive order.</w:t>
+      </w:r>
+    </w:p>
+    <w:p>
+      <w:pPr>
+        <w:spacing w:after="60" w:before="200"/>
         <w:ind w:left="863"/>
       </w:pPr>
       <w:r>
@@ -1338,6 +1382,50 @@
     <w:p>
       <w:pPr>
         <w:spacing w:after="60" w:before="200"/>
+        <w:ind w:left="431"/>
+      </w:pPr>
+      <w:r>
+        <w:rPr>
+          <w:rFonts w:ascii="Courier New" w:cs="Courier New" w:eastAsia="Courier New" w:hAnsi="Courier New"/>
+          <w:b/>
+          <w:bCs/>
+          <w:color w:val="1B2A4A"/>
+          <w:sz w:val="18"/>
+          <w:szCs w:val="18"/>
+        </w:rPr>
+        <w:t xml:space="preserve">§1.15  </w:t>
+      </w:r>
+      <w:r>
+        <w:rPr>
+          <w:rFonts w:ascii="Garamond" w:cs="Garamond" w:eastAsia="Garamond" w:hAnsi="Garamond"/>
+          <w:b/>
+          <w:bCs/>
+          <w:color w:val="1B2A4A"/>
+          <w:sz w:val="22"/>
+          <w:szCs w:val="22"/>
+        </w:rPr>
+        <w:t xml:space="preserve">Rights of the Accused</w:t>
+      </w:r>
+    </w:p>
+    <w:p>
+      <w:pPr>
+        <w:spacing w:after="120" w:before="0"/>
+        <w:ind w:left="431"/>
+        <w:jc w:val="both"/>
+      </w:pPr>
+      <w:r>
+        <w:rPr>
+          <w:rFonts w:ascii="Garamond" w:cs="Garamond" w:eastAsia="Garamond" w:hAnsi="Garamond"/>
+          <w:color w:val="2a2520"/>
+          <w:sz w:val="22"/>
+          <w:szCs w:val="22"/>
+        </w:rPr>
+        <w:t xml:space="preserve">Every person accused of a crime or subject to criminal proceedings holds the rights established in this section from the moment of accusation through final disposition.</w:t>
+      </w:r>
+    </w:p>
+    <w:p>
+      <w:pPr>
+        <w:spacing w:after="60" w:before="200"/>
         <w:ind w:left="863"/>
       </w:pPr>
       <w:r>
@@ -1514,6 +1602,50 @@
     <w:p>
       <w:pPr>
         <w:spacing w:after="60" w:before="200"/>
+        <w:ind w:left="431"/>
+      </w:pPr>
+      <w:r>
+        <w:rPr>
+          <w:rFonts w:ascii="Courier New" w:cs="Courier New" w:eastAsia="Courier New" w:hAnsi="Courier New"/>
+          <w:b/>
+          <w:bCs/>
+          <w:color w:val="1B2A4A"/>
+          <w:sz w:val="18"/>
+          <w:szCs w:val="18"/>
+        </w:rPr>
+        <w:t xml:space="preserve">§1.16  </w:t>
+      </w:r>
+      <w:r>
+        <w:rPr>
+          <w:rFonts w:ascii="Garamond" w:cs="Garamond" w:eastAsia="Garamond" w:hAnsi="Garamond"/>
+          <w:b/>
+          <w:bCs/>
+          <w:color w:val="1B2A4A"/>
+          <w:sz w:val="22"/>
+          <w:szCs w:val="22"/>
+        </w:rPr>
+        <w:t xml:space="preserve">Fair Trial Rights</w:t>
+      </w:r>
+    </w:p>
+    <w:p>
+      <w:pPr>
+        <w:spacing w:after="120" w:before="0"/>
+        <w:ind w:left="431"/>
+        <w:jc w:val="both"/>
+      </w:pPr>
+      <w:r>
+        <w:rPr>
+          <w:rFonts w:ascii="Garamond" w:cs="Garamond" w:eastAsia="Garamond" w:hAnsi="Garamond"/>
+          <w:color w:val="2a2520"/>
+          <w:sz w:val="22"/>
+          <w:szCs w:val="22"/>
+        </w:rPr>
+        <w:t xml:space="preserve">Every person subject to criminal proceedings has the right to a fair and timely trial. These rights may not be waived by prosecutorial pressure, plea incentive, or judicial scheduling convenience.</w:t>
+      </w:r>
+    </w:p>
+    <w:p>
+      <w:pPr>
+        <w:spacing w:after="60" w:before="200"/>
         <w:ind w:left="863"/>
       </w:pPr>
       <w:r>
@@ -1778,6 +1910,50 @@
     <w:p>
       <w:pPr>
         <w:spacing w:after="60" w:before="200"/>
+        <w:ind w:left="431"/>
+      </w:pPr>
+      <w:r>
+        <w:rPr>
+          <w:rFonts w:ascii="Courier New" w:cs="Courier New" w:eastAsia="Courier New" w:hAnsi="Courier New"/>
+          <w:b/>
+          <w:bCs/>
+          <w:color w:val="1B2A4A"/>
+          <w:sz w:val="18"/>
+          <w:szCs w:val="18"/>
+        </w:rPr>
+        <w:t xml:space="preserve">§1.19  </w:t>
+      </w:r>
+      <w:r>
+        <w:rPr>
+          <w:rFonts w:ascii="Garamond" w:cs="Garamond" w:eastAsia="Garamond" w:hAnsi="Garamond"/>
+          <w:b/>
+          <w:bCs/>
+          <w:color w:val="1B2A4A"/>
+          <w:sz w:val="22"/>
+          <w:szCs w:val="22"/>
+        </w:rPr>
+        <w:t xml:space="preserve">Criminal Law Limits</w:t>
+      </w:r>
+    </w:p>
+    <w:p>
+      <w:pPr>
+        <w:spacing w:after="120" w:before="0"/>
+        <w:ind w:left="431"/>
+        <w:jc w:val="both"/>
+      </w:pPr>
+      <w:r>
+        <w:rPr>
+          <w:rFonts w:ascii="Garamond" w:cs="Garamond" w:eastAsia="Garamond" w:hAnsi="Garamond"/>
+          <w:color w:val="2a2520"/>
+          <w:sz w:val="22"/>
+          <w:szCs w:val="22"/>
+        </w:rPr>
+        <w:t xml:space="preserve">The criminal law may not be applied retroactively or used to punish a person more than once for the same conduct. These prohibitions apply equally to the federal government and to every State.</w:t>
+      </w:r>
+    </w:p>
+    <w:p>
+      <w:pPr>
+        <w:spacing w:after="60" w:before="200"/>
         <w:ind w:left="863"/>
       </w:pPr>
       <w:r>
@@ -2433,6 +2609,50 @@
           <w:szCs w:val="22"/>
         </w:rPr>
         <w:t xml:space="preserve">Housing access for persons who cannot independently secure it is a Basic Needs Floor obligation under §10.1. Housing exclusion is an enforceable constitutional violation.</w:t>
+      </w:r>
+    </w:p>
+    <w:p>
+      <w:pPr>
+        <w:spacing w:after="60" w:before="200"/>
+        <w:ind w:left="431"/>
+      </w:pPr>
+      <w:r>
+        <w:rPr>
+          <w:rFonts w:ascii="Courier New" w:cs="Courier New" w:eastAsia="Courier New" w:hAnsi="Courier New"/>
+          <w:b/>
+          <w:bCs/>
+          <w:color w:val="1B2A4A"/>
+          <w:sz w:val="18"/>
+          <w:szCs w:val="18"/>
+        </w:rPr>
+        <w:t xml:space="preserve">§1.26  </w:t>
+      </w:r>
+      <w:r>
+        <w:rPr>
+          <w:rFonts w:ascii="Garamond" w:cs="Garamond" w:eastAsia="Garamond" w:hAnsi="Garamond"/>
+          <w:b/>
+          <w:bCs/>
+          <w:color w:val="1B2A4A"/>
+          <w:sz w:val="22"/>
+          <w:szCs w:val="22"/>
+        </w:rPr>
+        <w:t xml:space="preserve">Emergency Derogation</w:t>
+      </w:r>
+    </w:p>
+    <w:p>
+      <w:pPr>
+        <w:spacing w:after="120" w:before="0"/>
+        <w:ind w:left="431"/>
+        <w:jc w:val="both"/>
+      </w:pPr>
+      <w:r>
+        <w:rPr>
+          <w:rFonts w:ascii="Garamond" w:cs="Garamond" w:eastAsia="Garamond" w:hAnsi="Garamond"/>
+          <w:color w:val="2a2520"/>
+          <w:sz w:val="22"/>
+          <w:szCs w:val="22"/>
+        </w:rPr>
+        <w:t xml:space="preserve">No emergency — however severe — suspends the Individual Sovereignty Floor in full. Temporary derogation of certain rights is permitted only under the strict conditions of this section; the rights enumerated in §1.26.b may not be derogated under any circumstances.</w:t>
       </w:r>
     </w:p>
     <w:p>
@@ -4140,6 +4360,50 @@
     <w:p>
       <w:pPr>
         <w:spacing w:after="60" w:before="200"/>
+        <w:ind w:left="431"/>
+      </w:pPr>
+      <w:r>
+        <w:rPr>
+          <w:rFonts w:ascii="Courier New" w:cs="Courier New" w:eastAsia="Courier New" w:hAnsi="Courier New"/>
+          <w:b/>
+          <w:bCs/>
+          <w:color w:val="1B2A4A"/>
+          <w:sz w:val="18"/>
+          <w:szCs w:val="18"/>
+        </w:rPr>
+        <w:t xml:space="preserve">§2.3  </w:t>
+      </w:r>
+      <w:r>
+        <w:rPr>
+          <w:rFonts w:ascii="Garamond" w:cs="Garamond" w:eastAsia="Garamond" w:hAnsi="Garamond"/>
+          <w:b/>
+          <w:bCs/>
+          <w:color w:val="1B2A4A"/>
+          <w:sz w:val="22"/>
+          <w:szCs w:val="22"/>
+        </w:rPr>
+        <w:t xml:space="preserve">Prime Minister — Accountability and Formation</w:t>
+      </w:r>
+    </w:p>
+    <w:p>
+      <w:pPr>
+        <w:spacing w:after="120" w:before="0"/>
+        <w:ind w:left="431"/>
+        <w:jc w:val="both"/>
+      </w:pPr>
+      <w:r>
+        <w:rPr>
+          <w:rFonts w:ascii="Garamond" w:cs="Garamond" w:eastAsia="Garamond" w:hAnsi="Garamond"/>
+          <w:color w:val="2a2520"/>
+          <w:sz w:val="22"/>
+          <w:szCs w:val="22"/>
+        </w:rPr>
+        <w:t xml:space="preserve">The Prime Minister is accountable to the House through the mechanisms of this section. The House's power to remove the PM is matched by its constitutional obligation to maintain a functioning government.</w:t>
+      </w:r>
+    </w:p>
+    <w:p>
+      <w:pPr>
+        <w:spacing w:after="60" w:before="200"/>
         <w:ind w:left="863"/>
       </w:pPr>
       <w:r>
@@ -4272,6 +4536,50 @@
     <w:p>
       <w:pPr>
         <w:spacing w:after="60" w:before="200"/>
+        <w:ind w:left="431"/>
+      </w:pPr>
+      <w:r>
+        <w:rPr>
+          <w:rFonts w:ascii="Courier New" w:cs="Courier New" w:eastAsia="Courier New" w:hAnsi="Courier New"/>
+          <w:b/>
+          <w:bCs/>
+          <w:color w:val="1B2A4A"/>
+          <w:sz w:val="18"/>
+          <w:szCs w:val="18"/>
+        </w:rPr>
+        <w:t xml:space="preserve">§2.4  </w:t>
+      </w:r>
+      <w:r>
+        <w:rPr>
+          <w:rFonts w:ascii="Garamond" w:cs="Garamond" w:eastAsia="Garamond" w:hAnsi="Garamond"/>
+          <w:b/>
+          <w:bCs/>
+          <w:color w:val="1B2A4A"/>
+          <w:sz w:val="22"/>
+          <w:szCs w:val="22"/>
+        </w:rPr>
+        <w:t xml:space="preserve">Prime Minister — Legislative Instruments</w:t>
+      </w:r>
+    </w:p>
+    <w:p>
+      <w:pPr>
+        <w:spacing w:after="120" w:before="0"/>
+        <w:ind w:left="431"/>
+        <w:jc w:val="both"/>
+      </w:pPr>
+      <w:r>
+        <w:rPr>
+          <w:rFonts w:ascii="Garamond" w:cs="Garamond" w:eastAsia="Garamond" w:hAnsi="Garamond"/>
+          <w:color w:val="2a2520"/>
+          <w:sz w:val="22"/>
+          <w:szCs w:val="22"/>
+        </w:rPr>
+        <w:t xml:space="preserve">The PM holds two instruments for engaging the Legislature on enacted bills: the Suspensive Veto and the Fiscal Objection. These are tools of constitutional dialogue, not obstruction; the Legislature retains final authority in both cases.</w:t>
+      </w:r>
+    </w:p>
+    <w:p>
+      <w:pPr>
+        <w:spacing w:after="60" w:before="200"/>
         <w:ind w:left="863"/>
       </w:pPr>
       <w:r>
@@ -4404,6 +4712,50 @@
     <w:p>
       <w:pPr>
         <w:spacing w:after="60" w:before="200"/>
+        <w:ind w:left="431"/>
+      </w:pPr>
+      <w:r>
+        <w:rPr>
+          <w:rFonts w:ascii="Courier New" w:cs="Courier New" w:eastAsia="Courier New" w:hAnsi="Courier New"/>
+          <w:b/>
+          <w:bCs/>
+          <w:color w:val="1B2A4A"/>
+          <w:sz w:val="18"/>
+          <w:szCs w:val="18"/>
+        </w:rPr>
+        <w:t xml:space="preserve">§2.5  </w:t>
+      </w:r>
+      <w:r>
+        <w:rPr>
+          <w:rFonts w:ascii="Garamond" w:cs="Garamond" w:eastAsia="Garamond" w:hAnsi="Garamond"/>
+          <w:b/>
+          <w:bCs/>
+          <w:color w:val="1B2A4A"/>
+          <w:sz w:val="22"/>
+          <w:szCs w:val="22"/>
+        </w:rPr>
+        <w:t xml:space="preserve">Legislative Review Period</w:t>
+      </w:r>
+    </w:p>
+    <w:p>
+      <w:pPr>
+        <w:spacing w:after="120" w:before="0"/>
+        <w:ind w:left="431"/>
+        <w:jc w:val="both"/>
+      </w:pPr>
+      <w:r>
+        <w:rPr>
+          <w:rFonts w:ascii="Garamond" w:cs="Garamond" w:eastAsia="Garamond" w:hAnsi="Garamond"/>
+          <w:color w:val="2a2520"/>
+          <w:sz w:val="22"/>
+          <w:szCs w:val="22"/>
+        </w:rPr>
+        <w:t xml:space="preserve">Both executives hold a concurrent review period following final passage of any bill. The periods and their interaction are governed by this section.</w:t>
+      </w:r>
+    </w:p>
+    <w:p>
+      <w:pPr>
+        <w:spacing w:after="60" w:before="200"/>
         <w:ind w:left="863"/>
       </w:pPr>
       <w:r>
@@ -4751,6 +5103,50 @@
           <w:szCs w:val="22"/>
         </w:rPr>
         <w:t xml:space="preserve">Where the Legislature has been physically unable to convene due to an attack on the seat of government or other catastrophic external event, the 90-day waiting period of §2.8 is waived. Expedited activation requires joint certification by the Caretaker PM and the most senior available Supreme Court justice, published to the NRS, stating that the Legislature cannot convene due to catastrophic external circumstances. Upon such certification, the Senate may immediately assume the three emergency functions of §2.8 by majority of surviving members. Expedited activation expires automatically upon the House maintaining quorum and electing a Speaker.</w:t>
+      </w:r>
+    </w:p>
+    <w:p>
+      <w:pPr>
+        <w:spacing w:after="60" w:before="200"/>
+        <w:ind w:left="431"/>
+      </w:pPr>
+      <w:r>
+        <w:rPr>
+          <w:rFonts w:ascii="Courier New" w:cs="Courier New" w:eastAsia="Courier New" w:hAnsi="Courier New"/>
+          <w:b/>
+          <w:bCs/>
+          <w:color w:val="1B2A4A"/>
+          <w:sz w:val="18"/>
+          <w:szCs w:val="18"/>
+        </w:rPr>
+        <w:t xml:space="preserve">§2.9  </w:t>
+      </w:r>
+      <w:r>
+        <w:rPr>
+          <w:rFonts w:ascii="Garamond" w:cs="Garamond" w:eastAsia="Garamond" w:hAnsi="Garamond"/>
+          <w:b/>
+          <w:bCs/>
+          <w:color w:val="1B2A4A"/>
+          <w:sz w:val="22"/>
+          <w:szCs w:val="22"/>
+        </w:rPr>
+        <w:t xml:space="preserve">Clemency and Amnesty</w:t>
+      </w:r>
+    </w:p>
+    <w:p>
+      <w:pPr>
+        <w:spacing w:after="120" w:before="0"/>
+        <w:ind w:left="431"/>
+        <w:jc w:val="both"/>
+      </w:pPr>
+      <w:r>
+        <w:rPr>
+          <w:rFonts w:ascii="Garamond" w:cs="Garamond" w:eastAsia="Garamond" w:hAnsi="Garamond"/>
+          <w:color w:val="2a2520"/>
+          <w:sz w:val="22"/>
+          <w:szCs w:val="22"/>
+        </w:rPr>
+        <w:t xml:space="preserve">The pardon power is constitutionally divided and constrained. Clemency may only be granted within each executive's domain, with full transparency, and subject to cross-chamber review. Self-clemency is absolutely prohibited.</w:t>
       </w:r>
     </w:p>
     <w:p>
@@ -5094,6 +5490,50 @@
     <w:p>
       <w:pPr>
         <w:spacing w:after="60" w:before="200"/>
+        <w:ind w:left="431"/>
+      </w:pPr>
+      <w:r>
+        <w:rPr>
+          <w:rFonts w:ascii="Courier New" w:cs="Courier New" w:eastAsia="Courier New" w:hAnsi="Courier New"/>
+          <w:b/>
+          <w:bCs/>
+          <w:color w:val="1B2A4A"/>
+          <w:sz w:val="18"/>
+          <w:szCs w:val="18"/>
+        </w:rPr>
+        <w:t xml:space="preserve">§3.1  </w:t>
+      </w:r>
+      <w:r>
+        <w:rPr>
+          <w:rFonts w:ascii="Garamond" w:cs="Garamond" w:eastAsia="Garamond" w:hAnsi="Garamond"/>
+          <w:b/>
+          <w:bCs/>
+          <w:color w:val="1B2A4A"/>
+          <w:sz w:val="22"/>
+          <w:szCs w:val="22"/>
+        </w:rPr>
+        <w:t xml:space="preserve">The House of Representatives</w:t>
+      </w:r>
+    </w:p>
+    <w:p>
+      <w:pPr>
+        <w:spacing w:after="120" w:before="0"/>
+        <w:ind w:left="431"/>
+        <w:jc w:val="both"/>
+      </w:pPr>
+      <w:r>
+        <w:rPr>
+          <w:rFonts w:ascii="Garamond" w:cs="Garamond" w:eastAsia="Garamond" w:hAnsi="Garamond"/>
+          <w:color w:val="2a2520"/>
+          <w:sz w:val="22"/>
+          <w:szCs w:val="22"/>
+        </w:rPr>
+        <w:t xml:space="preserve">The House of Representatives is the proportional chamber of the Legislature — directly elected by citizens on the basis of population. All legislation originates in the House and the PM is elected and accountable to it.</w:t>
+      </w:r>
+    </w:p>
+    <w:p>
+      <w:pPr>
+        <w:spacing w:after="60" w:before="200"/>
         <w:ind w:left="863"/>
       </w:pPr>
       <w:r>
@@ -6018,6 +6458,50 @@
     <w:p>
       <w:pPr>
         <w:spacing w:after="60" w:before="200"/>
+        <w:ind w:left="431"/>
+      </w:pPr>
+      <w:r>
+        <w:rPr>
+          <w:rFonts w:ascii="Courier New" w:cs="Courier New" w:eastAsia="Courier New" w:hAnsi="Courier New"/>
+          <w:b/>
+          <w:bCs/>
+          <w:color w:val="1B2A4A"/>
+          <w:sz w:val="18"/>
+          <w:szCs w:val="18"/>
+        </w:rPr>
+        <w:t xml:space="preserve">§3.3  </w:t>
+      </w:r>
+      <w:r>
+        <w:rPr>
+          <w:rFonts w:ascii="Garamond" w:cs="Garamond" w:eastAsia="Garamond" w:hAnsi="Garamond"/>
+          <w:b/>
+          <w:bCs/>
+          <w:color w:val="1B2A4A"/>
+          <w:sz w:val="22"/>
+          <w:szCs w:val="22"/>
+        </w:rPr>
+        <w:t xml:space="preserve">Legislative Process and Passage</w:t>
+      </w:r>
+    </w:p>
+    <w:p>
+      <w:pPr>
+        <w:spacing w:after="120" w:before="0"/>
+        <w:ind w:left="431"/>
+        <w:jc w:val="both"/>
+      </w:pPr>
+      <w:r>
+        <w:rPr>
+          <w:rFonts w:ascii="Garamond" w:cs="Garamond" w:eastAsia="Garamond" w:hAnsi="Garamond"/>
+          <w:color w:val="2a2520"/>
+          <w:sz w:val="22"/>
+          <w:szCs w:val="22"/>
+        </w:rPr>
+        <w:t xml:space="preserve">Bills become law through the process established in this section. The default passage standard is an absolute majority of the full seated membership of both chambers; higher thresholds apply as specified.</w:t>
+      </w:r>
+    </w:p>
+    <w:p>
+      <w:pPr>
+        <w:spacing w:after="60" w:before="200"/>
         <w:ind w:left="863"/>
       </w:pPr>
       <w:r>
@@ -6810,6 +7294,50 @@
     <w:p>
       <w:pPr>
         <w:spacing w:after="60" w:before="200"/>
+        <w:ind w:left="431"/>
+      </w:pPr>
+      <w:r>
+        <w:rPr>
+          <w:rFonts w:ascii="Courier New" w:cs="Courier New" w:eastAsia="Courier New" w:hAnsi="Courier New"/>
+          <w:b/>
+          <w:bCs/>
+          <w:color w:val="1B2A4A"/>
+          <w:sz w:val="18"/>
+          <w:szCs w:val="18"/>
+        </w:rPr>
+        <w:t xml:space="preserve">§3.6  </w:t>
+      </w:r>
+      <w:r>
+        <w:rPr>
+          <w:rFonts w:ascii="Garamond" w:cs="Garamond" w:eastAsia="Garamond" w:hAnsi="Garamond"/>
+          <w:b/>
+          <w:bCs/>
+          <w:color w:val="1B2A4A"/>
+          <w:sz w:val="22"/>
+          <w:szCs w:val="22"/>
+        </w:rPr>
+        <w:t xml:space="preserve">Legislative Oversight and Transparency</w:t>
+      </w:r>
+    </w:p>
+    <w:p>
+      <w:pPr>
+        <w:spacing w:after="120" w:before="0"/>
+        <w:ind w:left="431"/>
+        <w:jc w:val="both"/>
+      </w:pPr>
+      <w:r>
+        <w:rPr>
+          <w:rFonts w:ascii="Garamond" w:cs="Garamond" w:eastAsia="Garamond" w:hAnsi="Garamond"/>
+          <w:color w:val="2a2520"/>
+          <w:sz w:val="22"/>
+          <w:szCs w:val="22"/>
+        </w:rPr>
+        <w:t xml:space="preserve">The Legislature operates under continuous Inspectorate oversight and is subject to the transparency obligations of this section. Oversight is informational only — the Inspectorates publish findings; they do not direct legislative outcomes.</w:t>
+      </w:r>
+    </w:p>
+    <w:p>
+      <w:pPr>
+        <w:spacing w:after="60" w:before="200"/>
         <w:ind w:left="863"/>
       </w:pPr>
       <w:r>
@@ -7069,6 +7597,50 @@
           <w:szCs w:val="22"/>
         </w:rPr>
         <w:t xml:space="preserve">Members are privileged from civil arrest and civil suit arising from acts performed in their legislative capacity: votes, speeches, committee testimony. This privilege does not extend to criminal conduct, conduct outside legislative functions, or conduct the EI has certified as a constitutional breach.</w:t>
+      </w:r>
+    </w:p>
+    <w:p>
+      <w:pPr>
+        <w:spacing w:after="60" w:before="200"/>
+        <w:ind w:left="431"/>
+      </w:pPr>
+      <w:r>
+        <w:rPr>
+          <w:rFonts w:ascii="Courier New" w:cs="Courier New" w:eastAsia="Courier New" w:hAnsi="Courier New"/>
+          <w:b/>
+          <w:bCs/>
+          <w:color w:val="1B2A4A"/>
+          <w:sz w:val="18"/>
+          <w:szCs w:val="18"/>
+        </w:rPr>
+        <w:t xml:space="preserve">§3.7  </w:t>
+      </w:r>
+      <w:r>
+        <w:rPr>
+          <w:rFonts w:ascii="Garamond" w:cs="Garamond" w:eastAsia="Garamond" w:hAnsi="Garamond"/>
+          <w:b/>
+          <w:bCs/>
+          <w:color w:val="1B2A4A"/>
+          <w:sz w:val="22"/>
+          <w:szCs w:val="22"/>
+        </w:rPr>
+        <w:t xml:space="preserve">Independent Statutory Officers</w:t>
+      </w:r>
+    </w:p>
+    <w:p>
+      <w:pPr>
+        <w:spacing w:after="120" w:before="0"/>
+        <w:ind w:left="431"/>
+        <w:jc w:val="both"/>
+      </w:pPr>
+      <w:r>
+        <w:rPr>
+          <w:rFonts w:ascii="Garamond" w:cs="Garamond" w:eastAsia="Garamond" w:hAnsi="Garamond"/>
+          <w:color w:val="2a2520"/>
+          <w:sz w:val="22"/>
+          <w:szCs w:val="22"/>
+        </w:rPr>
+        <w:t xml:space="preserve">The constitution authorizes a class of statutory officers who operate independently of both executives. Their independence is structural — fixed terms, merit appointment, and removal only on the grounds specified in enabling statute.</w:t>
       </w:r>
     </w:p>
     <w:p>
@@ -8468,6 +9040,50 @@
     <w:p>
       <w:pPr>
         <w:spacing w:after="60" w:before="200"/>
+        <w:ind w:left="431"/>
+      </w:pPr>
+      <w:r>
+        <w:rPr>
+          <w:rFonts w:ascii="Courier New" w:cs="Courier New" w:eastAsia="Courier New" w:hAnsi="Courier New"/>
+          <w:b/>
+          <w:bCs/>
+          <w:color w:val="1B2A4A"/>
+          <w:sz w:val="18"/>
+          <w:szCs w:val="18"/>
+        </w:rPr>
+        <w:t xml:space="preserve">§4.4  </w:t>
+      </w:r>
+      <w:r>
+        <w:rPr>
+          <w:rFonts w:ascii="Garamond" w:cs="Garamond" w:eastAsia="Garamond" w:hAnsi="Garamond"/>
+          <w:b/>
+          <w:bCs/>
+          <w:color w:val="1B2A4A"/>
+          <w:sz w:val="22"/>
+          <w:szCs w:val="22"/>
+        </w:rPr>
+        <w:t xml:space="preserve">Judgment Recognition and Authentication</w:t>
+      </w:r>
+    </w:p>
+    <w:p>
+      <w:pPr>
+        <w:spacing w:after="120" w:before="0"/>
+        <w:ind w:left="431"/>
+        <w:jc w:val="both"/>
+      </w:pPr>
+      <w:r>
+        <w:rPr>
+          <w:rFonts w:ascii="Garamond" w:cs="Garamond" w:eastAsia="Garamond" w:hAnsi="Garamond"/>
+          <w:color w:val="2a2520"/>
+          <w:sz w:val="22"/>
+          <w:szCs w:val="22"/>
+        </w:rPr>
+        <w:t xml:space="preserve">Judicial judgments, official records, and authenticated documents are recognized across all jurisdictions within the Republic. The NRS is the authentication infrastructure for this cross-jurisdictional recognition.</w:t>
+      </w:r>
+    </w:p>
+    <w:p>
+      <w:pPr>
+        <w:spacing w:after="60" w:before="200"/>
         <w:ind w:left="863"/>
       </w:pPr>
       <w:r>
@@ -8762,6 +9378,50 @@
     <w:p>
       <w:pPr>
         <w:spacing w:after="60" w:before="200"/>
+        <w:ind w:left="431"/>
+      </w:pPr>
+      <w:r>
+        <w:rPr>
+          <w:rFonts w:ascii="Courier New" w:cs="Courier New" w:eastAsia="Courier New" w:hAnsi="Courier New"/>
+          <w:b/>
+          <w:bCs/>
+          <w:color w:val="1B2A4A"/>
+          <w:sz w:val="18"/>
+          <w:szCs w:val="18"/>
+        </w:rPr>
+        <w:t xml:space="preserve">§5.1  </w:t>
+      </w:r>
+      <w:r>
+        <w:rPr>
+          <w:rFonts w:ascii="Garamond" w:cs="Garamond" w:eastAsia="Garamond" w:hAnsi="Garamond"/>
+          <w:b/>
+          <w:bCs/>
+          <w:color w:val="1B2A4A"/>
+          <w:sz w:val="22"/>
+          <w:szCs w:val="22"/>
+        </w:rPr>
+        <w:t xml:space="preserve">Citizenship</w:t>
+      </w:r>
+    </w:p>
+    <w:p>
+      <w:pPr>
+        <w:spacing w:after="120" w:before="0"/>
+        <w:ind w:left="431"/>
+        <w:jc w:val="both"/>
+      </w:pPr>
+      <w:r>
+        <w:rPr>
+          <w:rFonts w:ascii="Garamond" w:cs="Garamond" w:eastAsia="Garamond" w:hAnsi="Garamond"/>
+          <w:color w:val="2a2520"/>
+          <w:sz w:val="22"/>
+          <w:szCs w:val="22"/>
+        </w:rPr>
+        <w:t xml:space="preserve">Citizenship in the Republic is acquired by birth, descent, or naturalization under the conditions of this section. Citizens hold the full rights established in Article I and are eligible to vote, hold office, and stand for election.</w:t>
+      </w:r>
+    </w:p>
+    <w:p>
+      <w:pPr>
+        <w:spacing w:after="60" w:before="200"/>
         <w:ind w:left="863"/>
       </w:pPr>
       <w:r>
@@ -9373,6 +10033,50 @@
           <w:szCs w:val="22"/>
         </w:rPr>
         <w:t xml:space="preserve">Senate deadlock on CLT standard changes keeps the existing version in force. Deadlock cannot be weaponized to eliminate the CLT or make it impossibly difficult — the existing test remains operative.</w:t>
+      </w:r>
+    </w:p>
+    <w:p>
+      <w:pPr>
+        <w:spacing w:after="60" w:before="200"/>
+        <w:ind w:left="431"/>
+      </w:pPr>
+      <w:r>
+        <w:rPr>
+          <w:rFonts w:ascii="Courier New" w:cs="Courier New" w:eastAsia="Courier New" w:hAnsi="Courier New"/>
+          <w:b/>
+          <w:bCs/>
+          <w:color w:val="1B2A4A"/>
+          <w:sz w:val="18"/>
+          <w:szCs w:val="18"/>
+        </w:rPr>
+        <w:t xml:space="preserve">§5.5  </w:t>
+      </w:r>
+      <w:r>
+        <w:rPr>
+          <w:rFonts w:ascii="Garamond" w:cs="Garamond" w:eastAsia="Garamond" w:hAnsi="Garamond"/>
+          <w:b/>
+          <w:bCs/>
+          <w:color w:val="1B2A4A"/>
+          <w:sz w:val="22"/>
+          <w:szCs w:val="22"/>
+        </w:rPr>
+        <w:t xml:space="preserve">Founding Generation Citizenship</w:t>
+      </w:r>
+    </w:p>
+    <w:p>
+      <w:pPr>
+        <w:spacing w:after="120" w:before="0"/>
+        <w:ind w:left="431"/>
+        <w:jc w:val="both"/>
+      </w:pPr>
+      <w:r>
+        <w:rPr>
+          <w:rFonts w:ascii="Garamond" w:cs="Garamond" w:eastAsia="Garamond" w:hAnsi="Garamond"/>
+          <w:color w:val="2a2520"/>
+          <w:sz w:val="22"/>
+          <w:szCs w:val="22"/>
+        </w:rPr>
+        <w:t xml:space="preserve">The circumstances of ratification require a transitional citizenship grant for those who held voting rights at the moment of founding.</w:t>
       </w:r>
     </w:p>
     <w:p>
@@ -10362,6 +11066,50 @@
     <w:p>
       <w:pPr>
         <w:spacing w:after="60" w:before="200"/>
+        <w:ind w:left="431"/>
+      </w:pPr>
+      <w:r>
+        <w:rPr>
+          <w:rFonts w:ascii="Courier New" w:cs="Courier New" w:eastAsia="Courier New" w:hAnsi="Courier New"/>
+          <w:b/>
+          <w:bCs/>
+          <w:color w:val="1B2A4A"/>
+          <w:sz w:val="18"/>
+          <w:szCs w:val="18"/>
+        </w:rPr>
+        <w:t xml:space="preserve">§7.2  </w:t>
+      </w:r>
+      <w:r>
+        <w:rPr>
+          <w:rFonts w:ascii="Garamond" w:cs="Garamond" w:eastAsia="Garamond" w:hAnsi="Garamond"/>
+          <w:b/>
+          <w:bCs/>
+          <w:color w:val="1B2A4A"/>
+          <w:sz w:val="22"/>
+          <w:szCs w:val="22"/>
+        </w:rPr>
+        <w:t xml:space="preserve">Presidential Election System</w:t>
+      </w:r>
+    </w:p>
+    <w:p>
+      <w:pPr>
+        <w:spacing w:after="120" w:before="0"/>
+        <w:ind w:left="431"/>
+        <w:jc w:val="both"/>
+      </w:pPr>
+      <w:r>
+        <w:rPr>
+          <w:rFonts w:ascii="Garamond" w:cs="Garamond" w:eastAsia="Garamond" w:hAnsi="Garamond"/>
+          <w:color w:val="2a2520"/>
+          <w:sz w:val="22"/>
+          <w:szCs w:val="22"/>
+        </w:rPr>
+        <w:t xml:space="preserve">The President is elected through a two-component national system that combines a ranked-choice popular vote with regional representation. No candidate may win the presidency on the basis of either component alone.</w:t>
+      </w:r>
+    </w:p>
+    <w:p>
+      <w:pPr>
+        <w:spacing w:after="60" w:before="200"/>
         <w:ind w:left="863"/>
       </w:pPr>
       <w:r>
@@ -11061,6 +11809,50 @@
           <w:szCs w:val="22"/>
         </w:rPr>
         <w:t xml:space="preserve">If two candidates are within 0.5 percentage points of each other on the final combined score as calculated under §7.2.b, a head-to-head national RCV runoff is conducted between those two candidates. The runoff closes the edge-case gap where the combined score is mathematically indeterminate.</w:t>
+      </w:r>
+    </w:p>
+    <w:p>
+      <w:pPr>
+        <w:spacing w:after="60" w:before="200"/>
+        <w:ind w:left="431"/>
+      </w:pPr>
+      <w:r>
+        <w:rPr>
+          <w:rFonts w:ascii="Courier New" w:cs="Courier New" w:eastAsia="Courier New" w:hAnsi="Courier New"/>
+          <w:b/>
+          <w:bCs/>
+          <w:color w:val="1B2A4A"/>
+          <w:sz w:val="18"/>
+          <w:szCs w:val="18"/>
+        </w:rPr>
+        <w:t xml:space="preserve">§7.3  </w:t>
+      </w:r>
+      <w:r>
+        <w:rPr>
+          <w:rFonts w:ascii="Garamond" w:cs="Garamond" w:eastAsia="Garamond" w:hAnsi="Garamond"/>
+          <w:b/>
+          <w:bCs/>
+          <w:color w:val="1B2A4A"/>
+          <w:sz w:val="22"/>
+          <w:szCs w:val="22"/>
+        </w:rPr>
+        <w:t xml:space="preserve">Legislative Elections</w:t>
+      </w:r>
+    </w:p>
+    <w:p>
+      <w:pPr>
+        <w:spacing w:after="120" w:before="0"/>
+        <w:ind w:left="431"/>
+        <w:jc w:val="both"/>
+      </w:pPr>
+      <w:r>
+        <w:rPr>
+          <w:rFonts w:ascii="Garamond" w:cs="Garamond" w:eastAsia="Garamond" w:hAnsi="Garamond"/>
+          <w:color w:val="2a2520"/>
+          <w:sz w:val="22"/>
+          <w:szCs w:val="22"/>
+        </w:rPr>
+        <w:t xml:space="preserve">Legislative elections are administered by the Electoral Commission free from executive interference. The National Voting System is the uniform platform for all federal elections.</w:t>
       </w:r>
     </w:p>
     <w:p>
@@ -11448,6 +12240,50 @@
     <w:p>
       <w:pPr>
         <w:spacing w:after="60" w:before="200"/>
+        <w:ind w:left="431"/>
+      </w:pPr>
+      <w:r>
+        <w:rPr>
+          <w:rFonts w:ascii="Courier New" w:cs="Courier New" w:eastAsia="Courier New" w:hAnsi="Courier New"/>
+          <w:b/>
+          <w:bCs/>
+          <w:color w:val="1B2A4A"/>
+          <w:sz w:val="18"/>
+          <w:szCs w:val="18"/>
+        </w:rPr>
+        <w:t xml:space="preserve">§8.3  </w:t>
+      </w:r>
+      <w:r>
+        <w:rPr>
+          <w:rFonts w:ascii="Garamond" w:cs="Garamond" w:eastAsia="Garamond" w:hAnsi="Garamond"/>
+          <w:b/>
+          <w:bCs/>
+          <w:color w:val="1B2A4A"/>
+          <w:sz w:val="22"/>
+          <w:szCs w:val="22"/>
+        </w:rPr>
+        <w:t xml:space="preserve">Inspector General Selection</w:t>
+      </w:r>
+    </w:p>
+    <w:p>
+      <w:pPr>
+        <w:spacing w:after="120" w:before="0"/>
+        <w:ind w:left="431"/>
+        <w:jc w:val="both"/>
+      </w:pPr>
+      <w:r>
+        <w:rPr>
+          <w:rFonts w:ascii="Garamond" w:cs="Garamond" w:eastAsia="Garamond" w:hAnsi="Garamond"/>
+          <w:color w:val="2a2520"/>
+          <w:sz w:val="22"/>
+          <w:szCs w:val="22"/>
+        </w:rPr>
+        <w:t xml:space="preserve">Each Inspectorate is headed by an Inspector General selected through a cross-nominating process that ensures no branch selects its own overseer. The selection mechanisms for each IG are specified in this section.</w:t>
+      </w:r>
+    </w:p>
+    <w:p>
+      <w:pPr>
+        <w:spacing w:after="60" w:before="200"/>
         <w:ind w:left="863"/>
       </w:pPr>
       <w:r>
@@ -11580,6 +12416,50 @@
     <w:p>
       <w:pPr>
         <w:spacing w:after="60" w:before="200"/>
+        <w:ind w:left="431"/>
+      </w:pPr>
+      <w:r>
+        <w:rPr>
+          <w:rFonts w:ascii="Courier New" w:cs="Courier New" w:eastAsia="Courier New" w:hAnsi="Courier New"/>
+          <w:b/>
+          <w:bCs/>
+          <w:color w:val="1B2A4A"/>
+          <w:sz w:val="18"/>
+          <w:szCs w:val="18"/>
+        </w:rPr>
+        <w:t xml:space="preserve">§8.4  </w:t>
+      </w:r>
+      <w:r>
+        <w:rPr>
+          <w:rFonts w:ascii="Garamond" w:cs="Garamond" w:eastAsia="Garamond" w:hAnsi="Garamond"/>
+          <w:b/>
+          <w:bCs/>
+          <w:color w:val="1B2A4A"/>
+          <w:sz w:val="22"/>
+          <w:szCs w:val="22"/>
+        </w:rPr>
+        <w:t xml:space="preserve">Judicial Inspectorate Mandate</w:t>
+      </w:r>
+    </w:p>
+    <w:p>
+      <w:pPr>
+        <w:spacing w:after="120" w:before="0"/>
+        <w:ind w:left="431"/>
+        <w:jc w:val="both"/>
+      </w:pPr>
+      <w:r>
+        <w:rPr>
+          <w:rFonts w:ascii="Garamond" w:cs="Garamond" w:eastAsia="Garamond" w:hAnsi="Garamond"/>
+          <w:color w:val="2a2520"/>
+          <w:sz w:val="22"/>
+          <w:szCs w:val="22"/>
+        </w:rPr>
+        <w:t xml:space="preserve">The Judicial Inspectorate monitors the court system, administers the SC candidate registry, conducts compliance audits, and certifies lottery draws and panel selections throughout the constitution. Its mandate is informational only.</w:t>
+      </w:r>
+    </w:p>
+    <w:p>
+      <w:pPr>
+        <w:spacing w:after="60" w:before="200"/>
         <w:ind w:left="863"/>
       </w:pPr>
       <w:r>
@@ -11976,6 +12856,50 @@
     <w:p>
       <w:pPr>
         <w:spacing w:after="60" w:before="200"/>
+        <w:ind w:left="431"/>
+      </w:pPr>
+      <w:r>
+        <w:rPr>
+          <w:rFonts w:ascii="Courier New" w:cs="Courier New" w:eastAsia="Courier New" w:hAnsi="Courier New"/>
+          <w:b/>
+          <w:bCs/>
+          <w:color w:val="1B2A4A"/>
+          <w:sz w:val="18"/>
+          <w:szCs w:val="18"/>
+        </w:rPr>
+        <w:t xml:space="preserve">§8.5  </w:t>
+      </w:r>
+      <w:r>
+        <w:rPr>
+          <w:rFonts w:ascii="Garamond" w:cs="Garamond" w:eastAsia="Garamond" w:hAnsi="Garamond"/>
+          <w:b/>
+          <w:bCs/>
+          <w:color w:val="1B2A4A"/>
+          <w:sz w:val="22"/>
+          <w:szCs w:val="22"/>
+        </w:rPr>
+        <w:t xml:space="preserve">Inspector General Removal</w:t>
+      </w:r>
+    </w:p>
+    <w:p>
+      <w:pPr>
+        <w:spacing w:after="120" w:before="0"/>
+        <w:ind w:left="431"/>
+        <w:jc w:val="both"/>
+      </w:pPr>
+      <w:r>
+        <w:rPr>
+          <w:rFonts w:ascii="Garamond" w:cs="Garamond" w:eastAsia="Garamond" w:hAnsi="Garamond"/>
+          <w:color w:val="2a2520"/>
+          <w:sz w:val="22"/>
+          <w:szCs w:val="22"/>
+        </w:rPr>
+        <w:t xml:space="preserve">An Inspector General may be removed only through the mechanisms specified in this section. The removal thresholds are designed to prevent any single branch from eliminating its oversight body through ordinary political action.</w:t>
+      </w:r>
+    </w:p>
+    <w:p>
+      <w:pPr>
+        <w:spacing w:after="60" w:before="200"/>
         <w:ind w:left="863"/>
       </w:pPr>
       <w:r>
@@ -12103,6 +13027,50 @@
           <w:szCs w:val="22"/>
         </w:rPr>
         <w:t xml:space="preserve">JI Removal — the JI IG may only be removed for cause; no-cause removal is not available. The JI's lottery-based selection and its role in judicial independence oversight makes it the most insulated of the three offices.</w:t>
+      </w:r>
+    </w:p>
+    <w:p>
+      <w:pPr>
+        <w:spacing w:after="60" w:before="200"/>
+        <w:ind w:left="431"/>
+      </w:pPr>
+      <w:r>
+        <w:rPr>
+          <w:rFonts w:ascii="Courier New" w:cs="Courier New" w:eastAsia="Courier New" w:hAnsi="Courier New"/>
+          <w:b/>
+          <w:bCs/>
+          <w:color w:val="1B2A4A"/>
+          <w:sz w:val="18"/>
+          <w:szCs w:val="18"/>
+        </w:rPr>
+        <w:t xml:space="preserve">§8.6  </w:t>
+      </w:r>
+      <w:r>
+        <w:rPr>
+          <w:rFonts w:ascii="Garamond" w:cs="Garamond" w:eastAsia="Garamond" w:hAnsi="Garamond"/>
+          <w:b/>
+          <w:bCs/>
+          <w:color w:val="1B2A4A"/>
+          <w:sz w:val="22"/>
+          <w:szCs w:val="22"/>
+        </w:rPr>
+        <w:t xml:space="preserve">Inspectorate Operations and Mandate</w:t>
+      </w:r>
+    </w:p>
+    <w:p>
+      <w:pPr>
+        <w:spacing w:after="120" w:before="0"/>
+        <w:ind w:left="431"/>
+        <w:jc w:val="both"/>
+      </w:pPr>
+      <w:r>
+        <w:rPr>
+          <w:rFonts w:ascii="Garamond" w:cs="Garamond" w:eastAsia="Garamond" w:hAnsi="Garamond"/>
+          <w:color w:val="2a2520"/>
+          <w:sz w:val="22"/>
+          <w:szCs w:val="22"/>
+        </w:rPr>
+        <w:t xml:space="preserve">The three Inspectorates operate under a shared information-only mandate: they observe, audit, and publish. They hold no enforcement authority. Their power derives entirely from the constitutional weight of a permanent public record.</w:t>
       </w:r>
     </w:p>
     <w:p>
@@ -14074,6 +15042,50 @@
     <w:p>
       <w:pPr>
         <w:spacing w:after="60" w:before="200"/>
+        <w:ind w:left="431"/>
+      </w:pPr>
+      <w:r>
+        <w:rPr>
+          <w:rFonts w:ascii="Courier New" w:cs="Courier New" w:eastAsia="Courier New" w:hAnsi="Courier New"/>
+          <w:b/>
+          <w:bCs/>
+          <w:color w:val="1B2A4A"/>
+          <w:sz w:val="18"/>
+          <w:szCs w:val="18"/>
+        </w:rPr>
+        <w:t xml:space="preserve">§9.5  </w:t>
+      </w:r>
+      <w:r>
+        <w:rPr>
+          <w:rFonts w:ascii="Garamond" w:cs="Garamond" w:eastAsia="Garamond" w:hAnsi="Garamond"/>
+          <w:b/>
+          <w:bCs/>
+          <w:color w:val="1B2A4A"/>
+          <w:sz w:val="22"/>
+          <w:szCs w:val="22"/>
+        </w:rPr>
+        <w:t xml:space="preserve">NRS Administration and Continuity</w:t>
+      </w:r>
+    </w:p>
+    <w:p>
+      <w:pPr>
+        <w:spacing w:after="120" w:before="0"/>
+        <w:ind w:left="431"/>
+        <w:jc w:val="both"/>
+      </w:pPr>
+      <w:r>
+        <w:rPr>
+          <w:rFonts w:ascii="Garamond" w:cs="Garamond" w:eastAsia="Garamond" w:hAnsi="Garamond"/>
+          <w:color w:val="2a2520"/>
+          <w:sz w:val="22"/>
+          <w:szCs w:val="22"/>
+        </w:rPr>
+        <w:t xml:space="preserve">The National Record System is administered by a technically independent office under LI oversight. This section governs staffing, continuity, citizen access, and the technical standards that maintain the NRS's constitutional integrity.</w:t>
+      </w:r>
+    </w:p>
+    <w:p>
+      <w:pPr>
+        <w:spacing w:after="60" w:before="200"/>
         <w:ind w:left="863"/>
       </w:pPr>
       <w:r>
@@ -14896,6 +15908,50 @@
     <w:p>
       <w:pPr>
         <w:spacing w:after="60" w:before="200"/>
+        <w:ind w:left="431"/>
+      </w:pPr>
+      <w:r>
+        <w:rPr>
+          <w:rFonts w:ascii="Courier New" w:cs="Courier New" w:eastAsia="Courier New" w:hAnsi="Courier New"/>
+          <w:b/>
+          <w:bCs/>
+          <w:color w:val="1B2A4A"/>
+          <w:sz w:val="18"/>
+          <w:szCs w:val="18"/>
+        </w:rPr>
+        <w:t xml:space="preserve">§10.4  </w:t>
+      </w:r>
+      <w:r>
+        <w:rPr>
+          <w:rFonts w:ascii="Garamond" w:cs="Garamond" w:eastAsia="Garamond" w:hAnsi="Garamond"/>
+          <w:b/>
+          <w:bCs/>
+          <w:color w:val="1B2A4A"/>
+          <w:sz w:val="22"/>
+          <w:szCs w:val="22"/>
+        </w:rPr>
+        <w:t xml:space="preserve">The Monetary Authority</w:t>
+      </w:r>
+    </w:p>
+    <w:p>
+      <w:pPr>
+        <w:spacing w:after="120" w:before="0"/>
+        <w:ind w:left="431"/>
+        <w:jc w:val="both"/>
+      </w:pPr>
+      <w:r>
+        <w:rPr>
+          <w:rFonts w:ascii="Garamond" w:cs="Garamond" w:eastAsia="Garamond" w:hAnsi="Garamond"/>
+          <w:color w:val="2a2520"/>
+          <w:sz w:val="22"/>
+          <w:szCs w:val="22"/>
+        </w:rPr>
+        <w:t xml:space="preserve">The Monetary Authority is the Republic's constitutionally independent central bank, governed by an elected Director and an appointed board. Its mandate hierarchy and independence from political direction are established in this section.</w:t>
+      </w:r>
+    </w:p>
+    <w:p>
+      <w:pPr>
+        <w:spacing w:after="60" w:before="200"/>
         <w:ind w:left="863"/>
       </w:pPr>
       <w:r>
@@ -15204,6 +16260,50 @@
     <w:p>
       <w:pPr>
         <w:spacing w:after="60" w:before="200"/>
+        <w:ind w:left="431"/>
+      </w:pPr>
+      <w:r>
+        <w:rPr>
+          <w:rFonts w:ascii="Courier New" w:cs="Courier New" w:eastAsia="Courier New" w:hAnsi="Courier New"/>
+          <w:b/>
+          <w:bCs/>
+          <w:color w:val="1B2A4A"/>
+          <w:sz w:val="18"/>
+          <w:szCs w:val="18"/>
+        </w:rPr>
+        <w:t xml:space="preserve">§10.5  </w:t>
+      </w:r>
+      <w:r>
+        <w:rPr>
+          <w:rFonts w:ascii="Garamond" w:cs="Garamond" w:eastAsia="Garamond" w:hAnsi="Garamond"/>
+          <w:b/>
+          <w:bCs/>
+          <w:color w:val="1B2A4A"/>
+          <w:sz w:val="22"/>
+          <w:szCs w:val="22"/>
+        </w:rPr>
+        <w:t xml:space="preserve">Ethics and Conflict of Interest</w:t>
+      </w:r>
+    </w:p>
+    <w:p>
+      <w:pPr>
+        <w:spacing w:after="120" w:before="0"/>
+        <w:ind w:left="431"/>
+        <w:jc w:val="both"/>
+      </w:pPr>
+      <w:r>
+        <w:rPr>
+          <w:rFonts w:ascii="Garamond" w:cs="Garamond" w:eastAsia="Garamond" w:hAnsi="Garamond"/>
+          <w:color w:val="2a2520"/>
+          <w:sz w:val="22"/>
+          <w:szCs w:val="22"/>
+        </w:rPr>
+        <w:t xml:space="preserve">All constitutional officers are subject to the ethics obligations of this section from the moment they take office. These obligations run concurrently with and do not replace any statutory ethics requirements the Legislature may establish.</w:t>
+      </w:r>
+    </w:p>
+    <w:p>
+      <w:pPr>
+        <w:spacing w:after="60" w:before="200"/>
         <w:ind w:left="863"/>
       </w:pPr>
       <w:r>
@@ -15551,6 +16651,50 @@
           <w:szCs w:val="22"/>
         </w:rPr>
         <w:t xml:space="preserve">The EI is the primary enforcement mechanism for the §10.5 ethics provisions. The EI publishes all disclosed conflicts, all flagged violations, and all referrals to the Legislature for removal proceedings. The EI publishes facts and refers serious violations — it does not impose penalties directly.</w:t>
+      </w:r>
+    </w:p>
+    <w:p>
+      <w:pPr>
+        <w:spacing w:after="60" w:before="200"/>
+        <w:ind w:left="431"/>
+      </w:pPr>
+      <w:r>
+        <w:rPr>
+          <w:rFonts w:ascii="Courier New" w:cs="Courier New" w:eastAsia="Courier New" w:hAnsi="Courier New"/>
+          <w:b/>
+          <w:bCs/>
+          <w:color w:val="1B2A4A"/>
+          <w:sz w:val="18"/>
+          <w:szCs w:val="18"/>
+        </w:rPr>
+        <w:t xml:space="preserve">§10.6  </w:t>
+      </w:r>
+      <w:r>
+        <w:rPr>
+          <w:rFonts w:ascii="Garamond" w:cs="Garamond" w:eastAsia="Garamond" w:hAnsi="Garamond"/>
+          <w:b/>
+          <w:bCs/>
+          <w:color w:val="1B2A4A"/>
+          <w:sz w:val="22"/>
+          <w:szCs w:val="22"/>
+        </w:rPr>
+        <w:t xml:space="preserve">National Endowment</w:t>
+      </w:r>
+    </w:p>
+    <w:p>
+      <w:pPr>
+        <w:spacing w:after="120" w:before="0"/>
+        <w:ind w:left="431"/>
+        <w:jc w:val="both"/>
+      </w:pPr>
+      <w:r>
+        <w:rPr>
+          <w:rFonts w:ascii="Garamond" w:cs="Garamond" w:eastAsia="Garamond" w:hAnsi="Garamond"/>
+          <w:color w:val="2a2520"/>
+          <w:sz w:val="22"/>
+          <w:szCs w:val="22"/>
+        </w:rPr>
+        <w:t xml:space="preserve">The National Endowment is a constitutionally established reserve fund that provides BNF continuity during periods of severe revenue contraction. It operates independently of the annual budget process.</w:t>
       </w:r>
     </w:p>
     <w:p>
@@ -15938,6 +17082,50 @@
     <w:p>
       <w:pPr>
         <w:spacing w:after="60" w:before="200"/>
+        <w:ind w:left="431"/>
+      </w:pPr>
+      <w:r>
+        <w:rPr>
+          <w:rFonts w:ascii="Courier New" w:cs="Courier New" w:eastAsia="Courier New" w:hAnsi="Courier New"/>
+          <w:b/>
+          <w:bCs/>
+          <w:color w:val="1B2A4A"/>
+          <w:sz w:val="18"/>
+          <w:szCs w:val="18"/>
+        </w:rPr>
+        <w:t xml:space="preserve">§11.2  </w:t>
+      </w:r>
+      <w:r>
+        <w:rPr>
+          <w:rFonts w:ascii="Garamond" w:cs="Garamond" w:eastAsia="Garamond" w:hAnsi="Garamond"/>
+          <w:b/>
+          <w:bCs/>
+          <w:color w:val="1B2A4A"/>
+          <w:sz w:val="22"/>
+          <w:szCs w:val="22"/>
+        </w:rPr>
+        <w:t xml:space="preserve">Citizen Initiatives and Local Government</w:t>
+      </w:r>
+    </w:p>
+    <w:p>
+      <w:pPr>
+        <w:spacing w:after="120" w:before="0"/>
+        <w:ind w:left="431"/>
+        <w:jc w:val="both"/>
+      </w:pPr>
+      <w:r>
+        <w:rPr>
+          <w:rFonts w:ascii="Garamond" w:cs="Garamond" w:eastAsia="Garamond" w:hAnsi="Garamond"/>
+          <w:color w:val="2a2520"/>
+          <w:sz w:val="22"/>
+          <w:szCs w:val="22"/>
+        </w:rPr>
+        <w:t xml:space="preserve">Citizens hold direct legislative initiative rights at the federal level. Local governments are constitutionally recognized entities whose powers are established by State statute within the limits of this constitution.</w:t>
+      </w:r>
+    </w:p>
+    <w:p>
+      <w:pPr>
+        <w:spacing w:after="60" w:before="200"/>
         <w:ind w:left="863"/>
       </w:pPr>
       <w:r>
@@ -16452,6 +17640,50 @@
     <w:p>
       <w:pPr>
         <w:spacing w:after="60" w:before="200"/>
+        <w:ind w:left="431"/>
+      </w:pPr>
+      <w:r>
+        <w:rPr>
+          <w:rFonts w:ascii="Courier New" w:cs="Courier New" w:eastAsia="Courier New" w:hAnsi="Courier New"/>
+          <w:b/>
+          <w:bCs/>
+          <w:color w:val="1B2A4A"/>
+          <w:sz w:val="18"/>
+          <w:szCs w:val="18"/>
+        </w:rPr>
+        <w:t xml:space="preserve">§12.5  </w:t>
+      </w:r>
+      <w:r>
+        <w:rPr>
+          <w:rFonts w:ascii="Garamond" w:cs="Garamond" w:eastAsia="Garamond" w:hAnsi="Garamond"/>
+          <w:b/>
+          <w:bCs/>
+          <w:color w:val="1B2A4A"/>
+          <w:sz w:val="22"/>
+          <w:szCs w:val="22"/>
+        </w:rPr>
+        <w:t xml:space="preserve">Treaty-Based Military Authorization</w:t>
+      </w:r>
+    </w:p>
+    <w:p>
+      <w:pPr>
+        <w:spacing w:after="120" w:before="0"/>
+        <w:ind w:left="431"/>
+        <w:jc w:val="both"/>
+      </w:pPr>
+      <w:r>
+        <w:rPr>
+          <w:rFonts w:ascii="Garamond" w:cs="Garamond" w:eastAsia="Garamond" w:hAnsi="Garamond"/>
+          <w:color w:val="2a2520"/>
+          <w:sz w:val="22"/>
+          <w:szCs w:val="22"/>
+        </w:rPr>
+        <w:t xml:space="preserve">An existing treaty may provide an alternative basis for emergency military authorization outside the standard Tier framework. This authorization is strictly bounded and does not displace the Legislature's ultimate authority over sustained operations.</w:t>
+      </w:r>
+    </w:p>
+    <w:p>
+      <w:pPr>
+        <w:spacing w:after="60" w:before="200"/>
         <w:ind w:left="863"/>
       </w:pPr>
       <w:r>
@@ -17964,6 +19196,50 @@
     <w:p>
       <w:pPr>
         <w:spacing w:after="60" w:before="200"/>
+        <w:ind w:left="431"/>
+      </w:pPr>
+      <w:r>
+        <w:rPr>
+          <w:rFonts w:ascii="Courier New" w:cs="Courier New" w:eastAsia="Courier New" w:hAnsi="Courier New"/>
+          <w:b/>
+          <w:bCs/>
+          <w:color w:val="1B2A4A"/>
+          <w:sz w:val="18"/>
+          <w:szCs w:val="18"/>
+        </w:rPr>
+        <w:t xml:space="preserve">§14.3  </w:t>
+      </w:r>
+      <w:r>
+        <w:rPr>
+          <w:rFonts w:ascii="Garamond" w:cs="Garamond" w:eastAsia="Garamond" w:hAnsi="Garamond"/>
+          <w:b/>
+          <w:bCs/>
+          <w:color w:val="1B2A4A"/>
+          <w:sz w:val="22"/>
+          <w:szCs w:val="22"/>
+        </w:rPr>
+        <w:t xml:space="preserve">Rights and Governance in Compact Territories</w:t>
+      </w:r>
+    </w:p>
+    <w:p>
+      <w:pPr>
+        <w:spacing w:after="120" w:before="0"/>
+        <w:ind w:left="431"/>
+        <w:jc w:val="both"/>
+      </w:pPr>
+      <w:r>
+        <w:rPr>
+          <w:rFonts w:ascii="Garamond" w:cs="Garamond" w:eastAsia="Garamond" w:hAnsi="Garamond"/>
+          <w:color w:val="2a2520"/>
+          <w:sz w:val="22"/>
+          <w:szCs w:val="22"/>
+        </w:rPr>
+        <w:t xml:space="preserve">Article I rights apply in full within all compact territories. Indigenous Nations with compacts hold governance, judicial, and resource sovereignty within their territories, subject to the specific terms of this section.</w:t>
+      </w:r>
+    </w:p>
+    <w:p>
+      <w:pPr>
+        <w:spacing w:after="60" w:before="200"/>
         <w:ind w:left="863"/>
       </w:pPr>
       <w:r>
@@ -18184,6 +19460,50 @@
     <w:p>
       <w:pPr>
         <w:spacing w:after="60" w:before="200"/>
+        <w:ind w:left="431"/>
+      </w:pPr>
+      <w:r>
+        <w:rPr>
+          <w:rFonts w:ascii="Courier New" w:cs="Courier New" w:eastAsia="Courier New" w:hAnsi="Courier New"/>
+          <w:b/>
+          <w:bCs/>
+          <w:color w:val="1B2A4A"/>
+          <w:sz w:val="18"/>
+          <w:szCs w:val="18"/>
+        </w:rPr>
+        <w:t xml:space="preserve">§14.4  </w:t>
+      </w:r>
+      <w:r>
+        <w:rPr>
+          <w:rFonts w:ascii="Garamond" w:cs="Garamond" w:eastAsia="Garamond" w:hAnsi="Garamond"/>
+          <w:b/>
+          <w:bCs/>
+          <w:color w:val="1B2A4A"/>
+          <w:sz w:val="22"/>
+          <w:szCs w:val="22"/>
+        </w:rPr>
+        <w:t xml:space="preserve">Compact Administration and Continuity</w:t>
+      </w:r>
+    </w:p>
+    <w:p>
+      <w:pPr>
+        <w:spacing w:after="120" w:before="0"/>
+        <w:ind w:left="431"/>
+        <w:jc w:val="both"/>
+      </w:pPr>
+      <w:r>
+        <w:rPr>
+          <w:rFonts w:ascii="Garamond" w:cs="Garamond" w:eastAsia="Garamond" w:hAnsi="Garamond"/>
+          <w:color w:val="2a2520"/>
+          <w:sz w:val="22"/>
+          <w:szCs w:val="22"/>
+        </w:rPr>
+        <w:t xml:space="preserve">Compacts are living agreements administered through joint mechanisms. This section governs dispute resolution, review cycles, and the conditions under which a compact may be modified or terminated.</w:t>
+      </w:r>
+    </w:p>
+    <w:p>
+      <w:pPr>
+        <w:spacing w:after="60" w:before="200"/>
         <w:ind w:left="863"/>
       </w:pPr>
       <w:r>
@@ -18311,6 +19631,50 @@
           <w:szCs w:val="22"/>
         </w:rPr>
         <w:t xml:space="preserve">A compact may be terminated by mutual agreement only. Neither party may unilaterally terminate a compact. If the Nation seeks termination, the Republic must negotiate exit terms within 2 years. If no agreement is reached, the compact continues and the dispute is referred to the SC.</w:t>
+      </w:r>
+    </w:p>
+    <w:p>
+      <w:pPr>
+        <w:spacing w:after="60" w:before="200"/>
+        <w:ind w:left="431"/>
+      </w:pPr>
+      <w:r>
+        <w:rPr>
+          <w:rFonts w:ascii="Courier New" w:cs="Courier New" w:eastAsia="Courier New" w:hAnsi="Courier New"/>
+          <w:b/>
+          <w:bCs/>
+          <w:color w:val="1B2A4A"/>
+          <w:sz w:val="18"/>
+          <w:szCs w:val="18"/>
+        </w:rPr>
+        <w:t xml:space="preserve">§14.5  </w:t>
+      </w:r>
+      <w:r>
+        <w:rPr>
+          <w:rFonts w:ascii="Garamond" w:cs="Garamond" w:eastAsia="Garamond" w:hAnsi="Garamond"/>
+          <w:b/>
+          <w:bCs/>
+          <w:color w:val="1B2A4A"/>
+          <w:sz w:val="22"/>
+          <w:szCs w:val="22"/>
+        </w:rPr>
+        <w:t xml:space="preserve">Federal Obligations and New Compact Petitions</w:t>
+      </w:r>
+    </w:p>
+    <w:p>
+      <w:pPr>
+        <w:spacing w:after="120" w:before="0"/>
+        <w:ind w:left="431"/>
+        <w:jc w:val="both"/>
+      </w:pPr>
+      <w:r>
+        <w:rPr>
+          <w:rFonts w:ascii="Garamond" w:cs="Garamond" w:eastAsia="Garamond" w:hAnsi="Garamond"/>
+          <w:color w:val="2a2520"/>
+          <w:sz w:val="22"/>
+          <w:szCs w:val="22"/>
+        </w:rPr>
+        <w:t xml:space="preserve">The Republic holds affirmative obligations to compact territories. Indigenous communities that do not currently hold a compact retain the right to petition for compact recognition under this section.</w:t>
       </w:r>
     </w:p>
     <w:p>
@@ -18918,6 +20282,50 @@
     <w:p>
       <w:pPr>
         <w:spacing w:after="60" w:before="200"/>
+        <w:ind w:left="431"/>
+      </w:pPr>
+      <w:r>
+        <w:rPr>
+          <w:rFonts w:ascii="Courier New" w:cs="Courier New" w:eastAsia="Courier New" w:hAnsi="Courier New"/>
+          <w:b/>
+          <w:bCs/>
+          <w:color w:val="1B2A4A"/>
+          <w:sz w:val="18"/>
+          <w:szCs w:val="18"/>
+        </w:rPr>
+        <w:t xml:space="preserve">§15.3  </w:t>
+      </w:r>
+      <w:r>
+        <w:rPr>
+          <w:rFonts w:ascii="Garamond" w:cs="Garamond" w:eastAsia="Garamond" w:hAnsi="Garamond"/>
+          <w:b/>
+          <w:bCs/>
+          <w:color w:val="1B2A4A"/>
+          <w:sz w:val="22"/>
+          <w:szCs w:val="22"/>
+        </w:rPr>
+        <w:t xml:space="preserve">Unamendable Provisions</w:t>
+      </w:r>
+    </w:p>
+    <w:p>
+      <w:pPr>
+        <w:spacing w:after="120" w:before="0"/>
+        <w:ind w:left="431"/>
+        <w:jc w:val="both"/>
+      </w:pPr>
+      <w:r>
+        <w:rPr>
+          <w:rFonts w:ascii="Garamond" w:cs="Garamond" w:eastAsia="Garamond" w:hAnsi="Garamond"/>
+          <w:color w:val="2a2520"/>
+          <w:sz w:val="22"/>
+          <w:szCs w:val="22"/>
+        </w:rPr>
+        <w:t xml:space="preserve">Six provisions of this constitution may not be amended by any pathway — not by legislative supermajority, popular ratification, or any combination of both. These provisions define the minimum conditions for constitutional legitimacy itself.</w:t>
+      </w:r>
+    </w:p>
+    <w:p>
+      <w:pPr>
+        <w:spacing w:after="60" w:before="200"/>
         <w:ind w:left="863"/>
       </w:pPr>
       <w:r>
@@ -18957,6 +20365,50 @@
           <w:szCs w:val="22"/>
         </w:rPr>
         <w:t xml:space="preserve">The Unamendable Floor — six provisions that cannot be amended by any process: §1.3 (torture prohibition), §1.4 (slavery and forced labor), §1.14 (habeas corpus), §1.18 (public trial), §1.19 (no retroactive criminal laws), §1.28 (non-refoulement). Article I as a whole can only expand — no amendment may reduce any Article I right below its current floor.</w:t>
+      </w:r>
+    </w:p>
+    <w:p>
+      <w:pPr>
+        <w:spacing w:after="60" w:before="200"/>
+        <w:ind w:left="431"/>
+      </w:pPr>
+      <w:r>
+        <w:rPr>
+          <w:rFonts w:ascii="Courier New" w:cs="Courier New" w:eastAsia="Courier New" w:hAnsi="Courier New"/>
+          <w:b/>
+          <w:bCs/>
+          <w:color w:val="1B2A4A"/>
+          <w:sz w:val="18"/>
+          <w:szCs w:val="18"/>
+        </w:rPr>
+        <w:t xml:space="preserve">§15.4  </w:t>
+      </w:r>
+      <w:r>
+        <w:rPr>
+          <w:rFonts w:ascii="Garamond" w:cs="Garamond" w:eastAsia="Garamond" w:hAnsi="Garamond"/>
+          <w:b/>
+          <w:bCs/>
+          <w:color w:val="1B2A4A"/>
+          <w:sz w:val="22"/>
+          <w:szCs w:val="22"/>
+        </w:rPr>
+        <w:t xml:space="preserve">Territorial Integrity</w:t>
+      </w:r>
+    </w:p>
+    <w:p>
+      <w:pPr>
+        <w:spacing w:after="120" w:before="0"/>
+        <w:ind w:left="431"/>
+        <w:jc w:val="both"/>
+      </w:pPr>
+      <w:r>
+        <w:rPr>
+          <w:rFonts w:ascii="Garamond" w:cs="Garamond" w:eastAsia="Garamond" w:hAnsi="Garamond"/>
+          <w:color w:val="2a2520"/>
+          <w:sz w:val="22"/>
+          <w:szCs w:val="22"/>
+        </w:rPr>
+        <w:t xml:space="preserve">The Republic's territorial extent may only be reduced by the consent of the affected population. No State may leave the Republic through ordinary legislation, and no government may cede territory without meeting the threshold established in this section.</w:t>
       </w:r>
     </w:p>
     <w:p>
@@ -19696,6 +21148,50 @@
     <w:p>
       <w:pPr>
         <w:spacing w:after="60" w:before="200"/>
+        <w:ind w:left="431"/>
+      </w:pPr>
+      <w:r>
+        <w:rPr>
+          <w:rFonts w:ascii="Courier New" w:cs="Courier New" w:eastAsia="Courier New" w:hAnsi="Courier New"/>
+          <w:b/>
+          <w:bCs/>
+          <w:color w:val="1B2A4A"/>
+          <w:sz w:val="18"/>
+          <w:szCs w:val="18"/>
+        </w:rPr>
+        <w:t xml:space="preserve">§16.4  </w:t>
+      </w:r>
+      <w:r>
+        <w:rPr>
+          <w:rFonts w:ascii="Garamond" w:cs="Garamond" w:eastAsia="Garamond" w:hAnsi="Garamond"/>
+          <w:b/>
+          <w:bCs/>
+          <w:color w:val="1B2A4A"/>
+          <w:sz w:val="22"/>
+          <w:szCs w:val="22"/>
+        </w:rPr>
+        <w:t xml:space="preserve">Voting Rights and Access</w:t>
+      </w:r>
+    </w:p>
+    <w:p>
+      <w:pPr>
+        <w:spacing w:after="120" w:before="0"/>
+        <w:ind w:left="431"/>
+        <w:jc w:val="both"/>
+      </w:pPr>
+      <w:r>
+        <w:rPr>
+          <w:rFonts w:ascii="Garamond" w:cs="Garamond" w:eastAsia="Garamond" w:hAnsi="Garamond"/>
+          <w:color w:val="2a2520"/>
+          <w:sz w:val="22"/>
+          <w:szCs w:val="22"/>
+        </w:rPr>
+        <w:t xml:space="preserve">Every citizen holds the right to vote in federal elections. The Electoral Commission administers the Citizen Voting Credential and is constitutionally obligated to maintain access to the National Voting System for every eligible citizen.</w:t>
+      </w:r>
+    </w:p>
+    <w:p>
+      <w:pPr>
+        <w:spacing w:after="60" w:before="200"/>
         <w:ind w:left="863"/>
       </w:pPr>
       <w:r>
@@ -19911,6 +21407,50 @@
           <w:szCs w:val="22"/>
         </w:rPr>
         <w:t xml:space="preserve">At a State's request, the Electoral Commission may extend ballot information delivery to cover State and local races. The State bears the cost. The Commission may not refuse except on operational capacity grounds.</w:t>
+      </w:r>
+    </w:p>
+    <w:p>
+      <w:pPr>
+        <w:spacing w:after="60" w:before="200"/>
+        <w:ind w:left="431"/>
+      </w:pPr>
+      <w:r>
+        <w:rPr>
+          <w:rFonts w:ascii="Courier New" w:cs="Courier New" w:eastAsia="Courier New" w:hAnsi="Courier New"/>
+          <w:b/>
+          <w:bCs/>
+          <w:color w:val="1B2A4A"/>
+          <w:sz w:val="18"/>
+          <w:szCs w:val="18"/>
+        </w:rPr>
+        <w:t xml:space="preserve">§16.5  </w:t>
+      </w:r>
+      <w:r>
+        <w:rPr>
+          <w:rFonts w:ascii="Garamond" w:cs="Garamond" w:eastAsia="Garamond" w:hAnsi="Garamond"/>
+          <w:b/>
+          <w:bCs/>
+          <w:color w:val="1B2A4A"/>
+          <w:sz w:val="22"/>
+          <w:szCs w:val="22"/>
+        </w:rPr>
+        <w:t xml:space="preserve">Electoral Commission — Accountability</w:t>
+      </w:r>
+    </w:p>
+    <w:p>
+      <w:pPr>
+        <w:spacing w:after="120" w:before="0"/>
+        <w:ind w:left="431"/>
+        <w:jc w:val="both"/>
+      </w:pPr>
+      <w:r>
+        <w:rPr>
+          <w:rFonts w:ascii="Garamond" w:cs="Garamond" w:eastAsia="Garamond" w:hAnsi="Garamond"/>
+          <w:color w:val="2a2520"/>
+          <w:sz w:val="22"/>
+          <w:szCs w:val="22"/>
+        </w:rPr>
+        <w:t xml:space="preserve">The Electoral Commission's independence does not place it above accountability. This section governs its funding, Inspectorate oversight, removal of members for cause, and vacancy procedures.</w:t>
       </w:r>
     </w:p>
     <w:p>
@@ -20562,6 +22102,50 @@
     <w:p>
       <w:pPr>
         <w:spacing w:after="60" w:before="200"/>
+        <w:ind w:left="431"/>
+      </w:pPr>
+      <w:r>
+        <w:rPr>
+          <w:rFonts w:ascii="Courier New" w:cs="Courier New" w:eastAsia="Courier New" w:hAnsi="Courier New"/>
+          <w:b/>
+          <w:bCs/>
+          <w:color w:val="1B2A4A"/>
+          <w:sz w:val="18"/>
+          <w:szCs w:val="18"/>
+        </w:rPr>
+        <w:t xml:space="preserve">§17.3  </w:t>
+      </w:r>
+      <w:r>
+        <w:rPr>
+          <w:rFonts w:ascii="Garamond" w:cs="Garamond" w:eastAsia="Garamond" w:hAnsi="Garamond"/>
+          <w:b/>
+          <w:bCs/>
+          <w:color w:val="1B2A4A"/>
+          <w:sz w:val="22"/>
+          <w:szCs w:val="22"/>
+        </w:rPr>
+        <w:t xml:space="preserve">Operational Use Rights</w:t>
+      </w:r>
+    </w:p>
+    <w:p>
+      <w:pPr>
+        <w:spacing w:after="120" w:before="0"/>
+        <w:ind w:left="431"/>
+        <w:jc w:val="both"/>
+      </w:pPr>
+      <w:r>
+        <w:rPr>
+          <w:rFonts w:ascii="Garamond" w:cs="Garamond" w:eastAsia="Garamond" w:hAnsi="Garamond"/>
+          <w:color w:val="2a2520"/>
+          <w:sz w:val="22"/>
+          <w:szCs w:val="22"/>
+        </w:rPr>
+        <w:t xml:space="preserve">The federal government holds property interests within States through Operational Use Rights rather than fee ownership. This section governs registration, termination, improvements, and the rights of residents within federal use footprints.</w:t>
+      </w:r>
+    </w:p>
+    <w:p>
+      <w:pPr>
+        <w:spacing w:after="60" w:before="200"/>
         <w:ind w:left="863"/>
       </w:pPr>
       <w:r>
@@ -21208,6 +22792,50 @@
     <w:p>
       <w:pPr>
         <w:spacing w:after="60" w:before="200"/>
+        <w:ind w:left="431"/>
+      </w:pPr>
+      <w:r>
+        <w:rPr>
+          <w:rFonts w:ascii="Courier New" w:cs="Courier New" w:eastAsia="Courier New" w:hAnsi="Courier New"/>
+          <w:b/>
+          <w:bCs/>
+          <w:color w:val="1B2A4A"/>
+          <w:sz w:val="18"/>
+          <w:szCs w:val="18"/>
+        </w:rPr>
+        <w:t xml:space="preserve">§18.1  </w:t>
+      </w:r>
+      <w:r>
+        <w:rPr>
+          <w:rFonts w:ascii="Garamond" w:cs="Garamond" w:eastAsia="Garamond" w:hAnsi="Garamond"/>
+          <w:b/>
+          <w:bCs/>
+          <w:color w:val="1B2A4A"/>
+          <w:sz w:val="22"/>
+          <w:szCs w:val="22"/>
+        </w:rPr>
+        <w:t xml:space="preserve">Electoral Finance</w:t>
+      </w:r>
+    </w:p>
+    <w:p>
+      <w:pPr>
+        <w:spacing w:after="120" w:before="0"/>
+        <w:ind w:left="431"/>
+        <w:jc w:val="both"/>
+      </w:pPr>
+      <w:r>
+        <w:rPr>
+          <w:rFonts w:ascii="Garamond" w:cs="Garamond" w:eastAsia="Garamond" w:hAnsi="Garamond"/>
+          <w:color w:val="2a2520"/>
+          <w:sz w:val="22"/>
+          <w:szCs w:val="22"/>
+        </w:rPr>
+        <w:t xml:space="preserve">Electoral finance is regulated to prevent the structural distortion of democratic accountability through concentrated financial influence. The provisions of this section govern contributions, disclosure, and independent expenditures.</w:t>
+      </w:r>
+    </w:p>
+    <w:p>
+      <w:pPr>
+        <w:spacing w:after="60" w:before="200"/>
         <w:ind w:left="863"/>
       </w:pPr>
       <w:r>
@@ -21384,6 +23012,50 @@
     <w:p>
       <w:pPr>
         <w:spacing w:after="60" w:before="200"/>
+        <w:ind w:left="431"/>
+      </w:pPr>
+      <w:r>
+        <w:rPr>
+          <w:rFonts w:ascii="Courier New" w:cs="Courier New" w:eastAsia="Courier New" w:hAnsi="Courier New"/>
+          <w:b/>
+          <w:bCs/>
+          <w:color w:val="1B2A4A"/>
+          <w:sz w:val="18"/>
+          <w:szCs w:val="18"/>
+        </w:rPr>
+        <w:t xml:space="preserve">§18.2  </w:t>
+      </w:r>
+      <w:r>
+        <w:rPr>
+          <w:rFonts w:ascii="Garamond" w:cs="Garamond" w:eastAsia="Garamond" w:hAnsi="Garamond"/>
+          <w:b/>
+          <w:bCs/>
+          <w:color w:val="1B2A4A"/>
+          <w:sz w:val="22"/>
+          <w:szCs w:val="22"/>
+        </w:rPr>
+        <w:t xml:space="preserve">Campaign Conduct</w:t>
+      </w:r>
+    </w:p>
+    <w:p>
+      <w:pPr>
+        <w:spacing w:after="120" w:before="0"/>
+        <w:ind w:left="431"/>
+        <w:jc w:val="both"/>
+      </w:pPr>
+      <w:r>
+        <w:rPr>
+          <w:rFonts w:ascii="Garamond" w:cs="Garamond" w:eastAsia="Garamond" w:hAnsi="Garamond"/>
+          <w:color w:val="2a2520"/>
+          <w:sz w:val="22"/>
+          <w:szCs w:val="22"/>
+        </w:rPr>
+        <w:t xml:space="preserve">Candidates for constitutional office are subject to conduct standards administered by the Electoral Commission. These standards govern factual accuracy, media access, and foreign interference — not political content or viewpoint.</w:t>
+      </w:r>
+    </w:p>
+    <w:p>
+      <w:pPr>
+        <w:spacing w:after="60" w:before="200"/>
         <w:ind w:left="863"/>
       </w:pPr>
       <w:r>
@@ -21555,6 +23227,50 @@
           <w:szCs w:val="22"/>
         </w:rPr>
         <w:t xml:space="preserve">Incumbent Advantage Rules — constitutional officeholders standing for election in a different race must observe strict separation between their official functions and their campaign activities. Official resources — staff, communications, facilities — may not be used for campaign purposes. The EI audits incumbent campaigns for compliance.</w:t>
+      </w:r>
+    </w:p>
+    <w:p>
+      <w:pPr>
+        <w:spacing w:after="60" w:before="200"/>
+        <w:ind w:left="431"/>
+      </w:pPr>
+      <w:r>
+        <w:rPr>
+          <w:rFonts w:ascii="Courier New" w:cs="Courier New" w:eastAsia="Courier New" w:hAnsi="Courier New"/>
+          <w:b/>
+          <w:bCs/>
+          <w:color w:val="1B2A4A"/>
+          <w:sz w:val="18"/>
+          <w:szCs w:val="18"/>
+        </w:rPr>
+        <w:t xml:space="preserve">§18.3  </w:t>
+      </w:r>
+      <w:r>
+        <w:rPr>
+          <w:rFonts w:ascii="Garamond" w:cs="Garamond" w:eastAsia="Garamond" w:hAnsi="Garamond"/>
+          <w:b/>
+          <w:bCs/>
+          <w:color w:val="1B2A4A"/>
+          <w:sz w:val="22"/>
+          <w:szCs w:val="22"/>
+        </w:rPr>
+        <w:t xml:space="preserve">Public Campaign Financing</w:t>
+      </w:r>
+    </w:p>
+    <w:p>
+      <w:pPr>
+        <w:spacing w:after="120" w:before="0"/>
+        <w:ind w:left="431"/>
+        <w:jc w:val="both"/>
+      </w:pPr>
+      <w:r>
+        <w:rPr>
+          <w:rFonts w:ascii="Garamond" w:cs="Garamond" w:eastAsia="Garamond" w:hAnsi="Garamond"/>
+          <w:color w:val="2a2520"/>
+          <w:sz w:val="22"/>
+          <w:szCs w:val="22"/>
+        </w:rPr>
+        <w:t xml:space="preserve">The Republic maintains a publicly funded campaign financing system as an alternative to private fundraising. Participation is voluntary; the system is structured to ensure candidates who participate can mount effective campaigns.</w:t>
       </w:r>
     </w:p>
     <w:p>
@@ -22641,6 +24357,50 @@
           <w:szCs w:val="22"/>
         </w:rPr>
         <w:t xml:space="preserve">The Federated Republic is the legal continuation of the prior government as a matter of international law. All international obligations, financial commitments, treaty relationships, and contractual obligations of the prior government as of Day Zero are assumed by the Republic as its successor sovereign.</w:t>
+      </w:r>
+    </w:p>
+    <w:p>
+      <w:pPr>
+        <w:spacing w:after="60" w:before="200"/>
+        <w:ind w:left="431"/>
+      </w:pPr>
+      <w:r>
+        <w:rPr>
+          <w:rFonts w:ascii="Courier New" w:cs="Courier New" w:eastAsia="Courier New" w:hAnsi="Courier New"/>
+          <w:b/>
+          <w:bCs/>
+          <w:color w:val="1B2A4A"/>
+          <w:sz w:val="18"/>
+          <w:szCs w:val="18"/>
+        </w:rPr>
+        <w:t xml:space="preserve">§19.7  </w:t>
+      </w:r>
+      <w:r>
+        <w:rPr>
+          <w:rFonts w:ascii="Garamond" w:cs="Garamond" w:eastAsia="Garamond" w:hAnsi="Garamond"/>
+          <w:b/>
+          <w:bCs/>
+          <w:color w:val="1B2A4A"/>
+          <w:sz w:val="22"/>
+          <w:szCs w:val="22"/>
+        </w:rPr>
+        <w:t xml:space="preserve">Transition-Period Territory and Subdivision Elections</w:t>
+      </w:r>
+    </w:p>
+    <w:p>
+      <w:pPr>
+        <w:spacing w:after="120" w:before="0"/>
+        <w:ind w:left="431"/>
+        <w:jc w:val="both"/>
+      </w:pPr>
+      <w:r>
+        <w:rPr>
+          <w:rFonts w:ascii="Garamond" w:cs="Garamond" w:eastAsia="Garamond" w:hAnsi="Garamond"/>
+          <w:color w:val="2a2520"/>
+          <w:sz w:val="22"/>
+          <w:szCs w:val="22"/>
+        </w:rPr>
+        <w:t xml:space="preserve">The transition period provides specific mechanisms for territories seeking statehood and for prior-government states seeking subdivision. These mechanisms operate alongside the standard Phase structure and do not delay Phase activation.</w:t>
       </w:r>
     </w:p>
     <w:p>

</xml_diff>

<commit_message>
v172d: parent provision review — 6 fixes applied
§2.9: Clarified clemency cross-chamber review applies to Presidential
  clemency under §2.9.c only; self-clemency prohibition now explicitly
  covers all constitutional officers

§3.7: Replaced 'merit appointment' with accurate 'appointment from a
  JI-maintained registry' language

§5.1: Replaced 'descent' with 'parentage' to match constitutional
  language (jus sanguinis via §5.1.a, not a descent framework)

§8.4: Extended JI mandate description to include SDP, Regional Boundary
  Commission, and RSA Technical Integrity Commission lottery draws

§11.2/§11.3: Split 'Citizen Initiatives and Local Government' into two
  separate sections — §11.2 Citizen Legislative Initiative (with §11.2.a
  renamed to 'Initiative Process and Thresholds') and §11.3 Local
  Government as a standalone provision

All other 35 parents confirmed accurate, no changes needed
</commit_message>
<xml_diff>
--- a/constitution-v172.docx
+++ b/constitution-v172.docx
@@ -5146,7 +5146,7 @@
           <w:sz w:val="22"/>
           <w:szCs w:val="22"/>
         </w:rPr>
-        <w:t xml:space="preserve">The pardon power is constitutionally divided and constrained. Clemency may only be granted within each executive's domain, with full transparency, and subject to cross-chamber review. Self-clemency is absolutely prohibited.</w:t>
+        <w:t xml:space="preserve">The pardon power is constitutionally divided and constrained. Clemency may only be granted within each executive's domain, with full transparency, and subject to cross-chamber review. Presidential clemency is subject to cross-chamber review under §2.9.c. Self-clemency is absolutely prohibited for all constitutional officers.</w:t>
       </w:r>
     </w:p>
     <w:p>
@@ -7640,7 +7640,7 @@
           <w:sz w:val="22"/>
           <w:szCs w:val="22"/>
         </w:rPr>
-        <w:t xml:space="preserve">The constitution authorizes a class of statutory officers who operate independently of both executives. Their independence is structural — fixed terms, merit appointment, and removal only on the grounds specified in enabling statute.</w:t>
+        <w:t xml:space="preserve">The constitution authorizes a class of statutory officers who operate independently of both executives. Their independence is structural — fixed terms, appointment from a JI-maintained registry, and removal only on the grounds specified in enabling statute.</w:t>
       </w:r>
     </w:p>
     <w:p>
@@ -9416,7 +9416,7 @@
           <w:sz w:val="22"/>
           <w:szCs w:val="22"/>
         </w:rPr>
-        <w:t xml:space="preserve">Citizenship in the Republic is acquired by birth, descent, or naturalization under the conditions of this section. Citizens hold the full rights established in Article I and are eligible to vote, hold office, and stand for election.</w:t>
+        <w:t xml:space="preserve">Citizenship is acquired by birth, by parentage, or by naturalization under the conditions of this section. Citizens hold the full rights established in Article I and are eligible to vote, hold office, and stand for election.</w:t>
       </w:r>
     </w:p>
     <w:p>
@@ -12454,7 +12454,7 @@
           <w:sz w:val="22"/>
           <w:szCs w:val="22"/>
         </w:rPr>
-        <w:t xml:space="preserve">The Judicial Inspectorate monitors the court system, administers the SC candidate registry, conducts compliance audits, and certifies lottery draws and panel selections throughout the constitution. Its mandate is informational only.</w:t>
+        <w:t xml:space="preserve">The Judicial Inspectorate monitors the court system, administers the SC candidate registry, conducts compliance audits, and certifies lottery draws and panel selections throughout the constitution, including the State Designee Panel, the Regional Boundary Commission, and the RSA Technical Integrity Commission. Its mandate is informational only.</w:t>
       </w:r>
     </w:p>
     <w:p>
@@ -17104,23 +17104,23 @@
           <w:sz w:val="22"/>
           <w:szCs w:val="22"/>
         </w:rPr>
-        <w:t xml:space="preserve">Citizen Initiatives and Local Government</w:t>
-      </w:r>
-    </w:p>
-    <w:p>
-      <w:pPr>
-        <w:spacing w:after="120" w:before="0"/>
-        <w:ind w:left="431"/>
-        <w:jc w:val="both"/>
-      </w:pPr>
-      <w:r>
-        <w:rPr>
-          <w:rFonts w:ascii="Garamond" w:cs="Garamond" w:eastAsia="Garamond" w:hAnsi="Garamond"/>
-          <w:color w:val="2a2520"/>
-          <w:sz w:val="22"/>
-          <w:szCs w:val="22"/>
-        </w:rPr>
-        <w:t xml:space="preserve">Citizens hold direct legislative initiative rights at the federal level. Local governments are constitutionally recognized entities whose powers are established by State statute within the limits of this constitution.</w:t>
+        <w:t xml:space="preserve">Citizen Legislative Initiative</w:t>
+      </w:r>
+    </w:p>
+    <w:p>
+      <w:pPr>
+        <w:spacing w:after="120" w:before="0"/>
+        <w:ind w:left="431"/>
+        <w:jc w:val="both"/>
+      </w:pPr>
+      <w:r>
+        <w:rPr>
+          <w:rFonts w:ascii="Garamond" w:cs="Garamond" w:eastAsia="Garamond" w:hAnsi="Garamond"/>
+          <w:color w:val="2a2520"/>
+          <w:sz w:val="22"/>
+          <w:szCs w:val="22"/>
+        </w:rPr>
+        <w:t xml:space="preserve">Citizens hold the right to propose legislation directly to the Legislature through the initiative mechanism. The initiative is distinct from the referendum — it creates new law rather than repealing enacted law. The process and thresholds are established in §11.2.a.</w:t>
       </w:r>
     </w:p>
     <w:p>
@@ -17148,7 +17148,7 @@
           <w:sz w:val="22"/>
           <w:szCs w:val="22"/>
         </w:rPr>
-        <w:t xml:space="preserve">Citizen Legislative Initiative</w:t>
+        <w:t xml:space="preserve">Initiative Process and Thresholds</w:t>
       </w:r>
     </w:p>
     <w:p>
@@ -17170,18 +17170,18 @@
     <w:p>
       <w:pPr>
         <w:spacing w:after="60" w:before="200"/>
-        <w:ind w:left="863"/>
-      </w:pPr>
-      <w:r>
-        <w:rPr>
-          <w:rFonts w:ascii="Courier New" w:cs="Courier New" w:eastAsia="Courier New" w:hAnsi="Courier New"/>
-          <w:b/>
-          <w:bCs/>
-          <w:color w:val="1B2A4A"/>
-          <w:sz w:val="18"/>
-          <w:szCs w:val="18"/>
-        </w:rPr>
-        <w:t xml:space="preserve">§11.2.b  </w:t>
+        <w:ind w:left="431"/>
+      </w:pPr>
+      <w:r>
+        <w:rPr>
+          <w:rFonts w:ascii="Courier New" w:cs="Courier New" w:eastAsia="Courier New" w:hAnsi="Courier New"/>
+          <w:b/>
+          <w:bCs/>
+          <w:color w:val="1B2A4A"/>
+          <w:sz w:val="18"/>
+          <w:szCs w:val="18"/>
+        </w:rPr>
+        <w:t xml:space="preserve">§11.3  </w:t>
       </w:r>
       <w:r>
         <w:rPr>
@@ -17198,7 +17198,7 @@
     <w:p>
       <w:pPr>
         <w:spacing w:after="120" w:before="0"/>
-        <w:ind w:left="863"/>
+        <w:ind w:left="431"/>
         <w:jc w:val="both"/>
       </w:pPr>
       <w:r>

</xml_diff>

<commit_message>
v172g: three tabled discussion items resolved
§13.2 (Statehood Audit): Added explicit design rationale — statehood is
  a constitutional right of a qualifying jurisdiction, not a political
  favor to be granted or withheld by incumbent States.

§19.1.a (Activation Threshold): Added ratification threshold asymmetry
  rationale — founding requires achievability; the lower threshold is
  intentional. Higher amendment thresholds reflect the burden of changing
  a working system, not an oversight.

Tabled Item 1 (JI Portfolio Concentration): Resolved in v172f through
  Inspectorate rebalancing — referendum eligibility moved to LI, JI dual
  mandate explicitly acknowledged in §8.1.c and §8.4.
</commit_message>
<xml_diff>
--- a/constitution-v172.docx
+++ b/constitution-v172.docx
@@ -17928,7 +17928,7 @@
           <w:sz w:val="22"/>
           <w:szCs w:val="22"/>
         </w:rPr>
-        <w:t xml:space="preserve">The pathway from Territory to State is automatic upon successfully completing the Statehood Audit and Provisional Membership Period. No political vote in Congress is required once the audit is passed — statehood is a constitutional entitlement for any Territory that meets the criteria, not a political grant.</w:t>
+        <w:t xml:space="preserve">The pathway from Territory to State is automatic upon successfully completing the Statehood Audit and Provisional Membership Period. No political vote in Congress is required once the audit is passed — statehood is a constitutional entitlement for any Territory that meets the criteria, not a political grant. The automatic nature of this pathway is intentional — statehood is a constitutional right of a qualifying jurisdiction, not a political favor to be granted or withheld by incumbent States.</w:t>
       </w:r>
     </w:p>
     <w:p>
@@ -23564,7 +23564,7 @@
           <w:sz w:val="22"/>
           <w:szCs w:val="22"/>
         </w:rPr>
-        <w:t xml:space="preserve">Activated upon: (1) interim EC certification that the NVS is operational and meets §16.3; and (2) a national ratification vote achieving 60% affirmative support with at least 50% participation. The NVS certification requirement ensures the system that conducts the ratification vote meets constitutional standards before the vote itself.</w:t>
+        <w:t xml:space="preserve">Activated upon: (1) interim EC certification that the NVS is operational and meets §16.3; and (2) a national ratification vote achieving 60% affirmative support with at least 50% participation. The NVS certification requirement ensures the system that conducts the ratification vote meets constitutional standards before the vote itself. The ratification threshold is intentionally set lower than the amendment thresholds of §15.1 — founding requires achievability. An impractically high founding threshold would prevent the constitutional order from being established at all. Once established, the higher amendment thresholds reflect the greater burden of changing a working system.</w:t>
       </w:r>
     </w:p>
     <w:p>

</xml_diff>

<commit_message>
v172o: §13.8 State Immutability — States cannot split directly
A State's constitutional boundaries are fixed. Division into multiple
entities requires voluntary devolution to Territory status under §13.4
first — each resulting Territory then pursues Statehood independently
through §13.2 or §13.2.d. Partial subdivisions follow the same rule:
the separating portion must become a Territory before seeking
independent Statehood. State retains its constitutional status until
devolution takes effect; resulting Territories re-qualify without
prejudice from their current baseline.
</commit_message>
<xml_diff>
--- a/constitution-v172.docx
+++ b/constitution-v172.docx
@@ -19381,6 +19381,50 @@
           <w:szCs w:val="22"/>
         </w:rPr>
         <w:t xml:space="preserve">Senate ratification requires a simple majority of full seated membership. Upon ratification: the merging territory is incorporated into the existing State by operation of law from the date of ratification; the existing State's House seat allocation is recalculated at the next census; the existing State's two Senate seats remain unchanged; all residents of the merging territory become citizens and residents of the State for all constitutional purposes; and the LI publishes the updated State boundaries to the NRS within 30 days. Where a partial Territory merges, the remaining Territory continues under §13.1 and begins or continues the §13.2 Statehood Audit process from its current baseline.</w:t>
+      </w:r>
+    </w:p>
+    <w:p>
+      <w:pPr>
+        <w:spacing w:after="60" w:before="200"/>
+        <w:ind w:left="431"/>
+      </w:pPr>
+      <w:r>
+        <w:rPr>
+          <w:rFonts w:ascii="Courier New" w:cs="Courier New" w:eastAsia="Courier New" w:hAnsi="Courier New"/>
+          <w:b/>
+          <w:bCs/>
+          <w:color w:val="1B2A4A"/>
+          <w:sz w:val="18"/>
+          <w:szCs w:val="18"/>
+        </w:rPr>
+        <w:t xml:space="preserve">§13.8  </w:t>
+      </w:r>
+      <w:r>
+        <w:rPr>
+          <w:rFonts w:ascii="Garamond" w:cs="Garamond" w:eastAsia="Garamond" w:hAnsi="Garamond"/>
+          <w:b/>
+          <w:bCs/>
+          <w:color w:val="1B2A4A"/>
+          <w:sz w:val="22"/>
+          <w:szCs w:val="22"/>
+        </w:rPr>
+        <w:t xml:space="preserve">State Immutability</w:t>
+      </w:r>
+    </w:p>
+    <w:p>
+      <w:pPr>
+        <w:spacing w:after="120" w:before="0"/>
+        <w:ind w:left="431"/>
+        <w:jc w:val="both"/>
+      </w:pPr>
+      <w:r>
+        <w:rPr>
+          <w:rFonts w:ascii="Garamond" w:cs="Garamond" w:eastAsia="Garamond" w:hAnsi="Garamond"/>
+          <w:color w:val="2a2520"/>
+          <w:sz w:val="22"/>
+          <w:szCs w:val="22"/>
+        </w:rPr>
+        <w:t xml:space="preserve">A State's constitutional boundaries are fixed. No constitutional mechanism permits a State to divide directly into two or more States. Where a State seeks to subdivide, it must first voluntarily devolve to Territory status under §13.4 — each resulting Territory then pursues Statehood independently through §13.2 or §13.2.d. The same requirement applies to any partial subdivision: the separating portion must first become a Territory before it may seek independent Statehood. A State undergoing this process retains its constitutional status until devolution takes effect; the resulting Territories re-qualify from their current baseline without prejudice.</w:t>
       </w:r>
     </w:p>
     <w:p>

</xml_diff>

<commit_message>
v172u: §3.4/§3.4.b redistricting — EC draws interim maps, LI audits
§3.4 parent: LI interim map drawing replaced with EC. Added that States
  may request drawing consulting from the EC at any point; consulting
  is advisory and does not transfer the State's map-drawing responsibility.

§3.4.b: Redesigned compliance pathway —
  - LI reviews State maps and publishes findings (audit role only)
  - If corrected map still fails: EC draws interim compliant map
  - EC map takes effect at next election
  - EC map is retired automatically when State submits a LI-certified
    compliant map — State retains its map-drawing responsibility
  - Explicit statement: LI cannot draw maps (review only);
    EC cannot impose a permanent map (interim only)

This applies the same EC-draws/LI-audits principle established for
Territorial district drawing (§3.4.c) consistently to the State
interim map mechanism.
</commit_message>
<xml_diff>
--- a/constitution-v172.docx
+++ b/constitution-v172.docx
@@ -6716,7 +6716,7 @@
           <w:sz w:val="22"/>
           <w:szCs w:val="22"/>
         </w:rPr>
-        <w:t xml:space="preserve">States draw their own House district maps following each census, subject to compliance review by the Legislative Inspectorate against the criteria established in §3.4.a. The LI may draw an interim compliant map where a State fails to submit a conforming map within the required period. Territorial district maps are drawn by the Electoral Commission under §3.4.c, subject to the same §3.4.a criteria and LI compliance review.</w:t>
+        <w:t xml:space="preserve">States draw their own House district maps following each census, subject to compliance review by the Legislative Inspectorate against the criteria established in §3.4.a. Where a State fails repeated review, the Electoral Commission draws an interim compliant map under §3.4.b pending State compliance. A State may request drawing consulting from the EC at any point in the redistricting process; such consulting is advisory and does not transfer the State's map-drawing responsibility to the EC. Territorial district maps are drawn by the Electoral Commission under §3.4.c, subject to the same §3.4.a criteria and LI compliance review.</w:t>
       </w:r>
     </w:p>
     <w:p>
@@ -6804,7 +6804,7 @@
           <w:sz w:val="22"/>
           <w:szCs w:val="22"/>
         </w:rPr>
-        <w:t xml:space="preserve">The LI reviews all State-drawn district maps within 60 days of submission. If a map fails the §3.4.a criteria, the LI publishes specific findings and the State must submit a corrected map within 30 days. If the corrected map still fails, the LI draws a compliant interim map. The LI cannot draw a permanent map — only an interim one pending State compliance.</w:t>
+        <w:t xml:space="preserve">The LI reviews all State-drawn district maps within 60 days of submission and publishes its compliance findings to the NRS. If a map fails the §3.4.a criteria, the LI publishes specific findings and the State must submit a corrected map within 30 days. If the corrected map still fails, the Electoral Commission draws an interim compliant map using the §3.4.a criteria, which takes effect at the next election. The EC-drawn interim map is not permanent — it is retired automatically when the State submits and the LI certifies a compliant State-drawn map. Until then, elections proceed on the EC-drawn map. The LI cannot draw district maps; its role is compliance review only. The EC cannot impose a permanent map; its interim map creates an incentive for State compliance, not a substitute for it.</w:t>
       </w:r>
     </w:p>
     <w:p>

</xml_diff>

<commit_message>
v172ac: remove §3.3.e Presidential Review Condition
The provision was logically inconsistent with the dual executive domain
separation. The President reviewing domestic legislation — even at
voluntary Senate invitation — places the President in the PM's
constitutional territory. No other institution fits either: the SC is
judicial, the Inspectorates are oversight bodies, neither is an
executive legislative check.

The parliamentary design accepts this trade-off by intent. The PM's
accountability to the House is the constitutional check on domestic
legislation. The remedies for bad laws are the citizen referendum
under §11.1, post-enactment SC challenge, and ultimately the
electorate. That is not a gap — it is the design.
</commit_message>
<xml_diff>
--- a/constitution-v172.docx
+++ b/constitution-v172.docx
@@ -6673,50 +6673,6 @@
           <w:szCs w:val="22"/>
         </w:rPr>
         <w:t xml:space="preserve">Where the constitution requires the Legislature to enact specific legislation by statute and the Legislature fails to do so within a specified period: the LI publishes a non-compliance finding; the mandate becomes justiciable in the SC; for mandates tied to constitutional rights, affected parties may bring direct constitutional claims. The Legislature's statutory delegations are genuine constitutional mandates.</w:t>
-      </w:r>
-    </w:p>
-    <w:p>
-      <w:pPr>
-        <w:spacing w:after="60" w:before="200"/>
-        <w:ind w:left="863"/>
-      </w:pPr>
-      <w:r>
-        <w:rPr>
-          <w:rFonts w:ascii="Courier New" w:cs="Courier New" w:eastAsia="Courier New" w:hAnsi="Courier New"/>
-          <w:b/>
-          <w:bCs/>
-          <w:color w:val="1B2A4A"/>
-          <w:sz w:val="18"/>
-          <w:szCs w:val="18"/>
-        </w:rPr>
-        <w:t xml:space="preserve">§3.3.e  </w:t>
-      </w:r>
-      <w:r>
-        <w:rPr>
-          <w:rFonts w:ascii="Garamond" w:cs="Garamond" w:eastAsia="Garamond" w:hAnsi="Garamond"/>
-          <w:b/>
-          <w:bCs/>
-          <w:color w:val="1B2A4A"/>
-          <w:sz w:val="22"/>
-          <w:szCs w:val="22"/>
-        </w:rPr>
-        <w:t xml:space="preserve">Presidential Review Condition</w:t>
-      </w:r>
-    </w:p>
-    <w:p>
-      <w:pPr>
-        <w:spacing w:after="120" w:before="0"/>
-        <w:ind w:left="863"/>
-        <w:jc w:val="both"/>
-      </w:pPr>
-      <w:r>
-        <w:rPr>
-          <w:rFonts w:ascii="Garamond" w:cs="Garamond" w:eastAsia="Garamond" w:hAnsi="Garamond"/>
-          <w:color w:val="2a2520"/>
-          <w:sz w:val="22"/>
-          <w:szCs w:val="22"/>
-        </w:rPr>
-        <w:t xml:space="preserve">The Senate may adopt a bill that includes a Presidential Review condition. The condition must state: (1) a review period of no more than 30 days — if no period is stated the default is 14 days; and (2) the specific subject matter or constitutional concern the review relates to. A condition that states no scope is void and the bill proceeds as if no condition were attached. The review period runs within the Senate's legislative timeline and does not extend the overall session clock. A bill adopted with a valid Presidential Review condition is transmitted to the President with the condition text published to the NRS. The President reviews the bill within the stated scope and period. If the President approves, the bill proceeds to PM assent under the standard process. If the President does not respond within the stated period, the bill is treated as approved and proceeds to PM assent; the EI records the failure to respond as a constitutional lapse and publishes a notice to the NRS. If the President rejects the bill, the rejection must be published to the NRS with written reasoning addressing the stated scope; a rejection that does not address the stated scope is void and the bill proceeds to PM assent. A valid rejection is treated as a Senate rejection — the bill is returned to the House for reconsideration as if the Senate had not passed it. A bill returned to the House under this provision and subsequently repassed by the House may not, when resubmitted to the Senate, be adopted with a Presidential Review condition on that same bill — it proceeds through the Senate under the standard process.</w:t>
       </w:r>
     </w:p>
     <w:p>

</xml_diff>

<commit_message>
update: new seal versions + rebuilt DOCX
- seal.png: primary seal (darker, for document use)
- seal-watermark.png: light version for watermark use
- constitution-v172.docx: rebuilt with correct seal, matching original
  formatting precisely (margins, spacing, no page breaks between articles)
</commit_message>
<xml_diff>
--- a/constitution-v172.docx
+++ b/constitution-v172.docx
@@ -51,7 +51,6 @@
     <w:p>
       <w:pPr>
         <w:spacing w:after="200" w:before="0"/>
-        <w:jc w:val="left"/>
       </w:pPr>
       <w:r>
         <w:rPr>
@@ -70,7 +69,6 @@
     <w:p>
       <w:pPr>
         <w:spacing w:after="200" w:before="0"/>
-        <w:jc w:val="left"/>
       </w:pPr>
       <w:r>
         <w:rPr>
@@ -89,7 +87,6 @@
     <w:p>
       <w:pPr>
         <w:spacing w:after="800" w:before="0"/>
-        <w:jc w:val="left"/>
       </w:pPr>
       <w:r>
         <w:rPr>
@@ -108,7 +105,6 @@
     <w:p>
       <w:pPr>
         <w:spacing w:after="200" w:before="0"/>
-        <w:jc w:val="left"/>
       </w:pPr>
       <w:r>
         <w:rPr>
@@ -125,7 +121,6 @@
     <w:p>
       <w:pPr>
         <w:spacing w:after="480" w:before="0"/>
-        <w:jc w:val="left"/>
       </w:pPr>
       <w:r>
         <w:rPr>

</xml_diff>

<commit_message>
update: DOCX with cover page, gold rule, transparent seal
- Dedicated cover page with page break (Preamble starts page 2)
- Gold horizontal rule: bottom border on empty para 4 (color C9A84C,
  sz=6, single) — extracted from original XML
- Seal: transparent background via corner flood fill
- All spacing matched exactly from original document XML
</commit_message>
<xml_diff>
--- a/constitution-v172.docx
+++ b/constitution-v172.docx
@@ -96,7 +96,11 @@
     </w:p>
     <w:p>
       <w:pPr>
+        <w:pBdr>
+          <w:bottom w:val="single" w:color="C9A84C" w:sz="6" w:space="1"/>
+        </w:pBdr>
         <w:spacing w:after="400" w:before="0"/>
+        <w:jc w:val="center"/>
       </w:pPr>
       <w:r>
         <w:t xml:space="preserve"/>
@@ -143,6 +147,7 @@
         <w:spacing w:after="0" w:before="0"/>
       </w:pPr>
       <w:r>
+        <w:br/>
         <w:t xml:space="preserve"/>
       </w:r>
     </w:p>

</xml_diff>

<commit_message>
v172ai: Article I focused review — 5 issues resolved
Colon-label:
- §1.1: 'Self-executing right:' opener replaced with operative statement

Stale cross-reference:
- §1.4: §10.7.a → §4.5 (Jury Service moved to Article IV in v172z)

Structural misplacement:
- §1.5.b 'Separation of Church and State' moved from §1.5 (Expression)
  to §1.6.a under §1.6 (Freedom of Thought, Conscience, and Religion)
  where it logically belongs; §1.6 previously had no sub-provisions

Redundancy:
- §1.12 parent: restatement of §1.12.a through §1.12.c trimmed to
  single operative statement + pointer
- §1.25 parent: duplication with §1.25.a resolved; parent rewritten
  as a summary constitutional statement pointing to §1.25.a and §1.25.b
</commit_message>
<xml_diff>
--- a/constitution-v172.docx
+++ b/constitution-v172.docx
@@ -263,7 +263,7 @@
           <w:sz w:val="22"/>
           <w:szCs w:val="22"/>
         </w:rPr>
-        <w:t xml:space="preserve">Self-executing right: every person may seek legal remedy for any rights violation. Court access cannot be made meaninglessly expensive through procedural costs. If the Legislature fails to fund legal aid, courts appoint counsel at public expense until a statutory framework exists — the self-executing default ensures the right is never purely nominal.</w:t>
+        <w:t xml:space="preserve">Every person may seek legal remedy for any rights violation — a self-executing right that courts may not make meaninglessly expensive through procedural costs. If the Legislature fails to fund legal aid, courts appoint counsel at public expense until a statutory framework exists — the self-executing default ensures the right is never purely nominal.</w:t>
       </w:r>
     </w:p>
     <w:p>
@@ -416,7 +416,7 @@
           <w:sz w:val="22"/>
           <w:szCs w:val="22"/>
         </w:rPr>
-        <w:t xml:space="preserve">Slavery, forced labor, debt bondage, and compelled service are prohibited absolutely and in all forms. The prohibition extends to all persons within the Republic's jurisdiction, not merely to citizens. Jury service required under §10.7.a and lawful sentences of community service imposed by a court do not constitute forced labor under this provision.</w:t>
+        <w:t xml:space="preserve">Slavery, forced labor, debt bondage, and compelled service are prohibited absolutely and in all forms. The prohibition extends to all persons within the Republic's jurisdiction, not merely to citizens. Jury service required under §4.5 and lawful sentences of community service imposed by a court do not constitute forced labor under this provision.</w:t>
       </w:r>
     </w:p>
     <w:p>
@@ -536,7 +536,58 @@
           <w:sz w:val="18"/>
           <w:szCs w:val="18"/>
         </w:rPr>
-        <w:t xml:space="preserve">§1.5.b  </w:t>
+        <w:t xml:space="preserve">§1.6  </w:t>
+      </w:r>
+      <w:r>
+        <w:rPr>
+          <w:rFonts w:ascii="Garamond" w:cs="Garamond" w:eastAsia="Garamond" w:hAnsi="Garamond"/>
+          <w:b/>
+          <w:bCs/>
+          <w:i w:val="false"/>
+          <w:iCs w:val="false"/>
+          <w:color w:val="1B2A4A"/>
+          <w:sz w:val="22"/>
+          <w:szCs w:val="22"/>
+        </w:rPr>
+        <w:t xml:space="preserve">Freedom of Thought, Conscience, and Religion</w:t>
+      </w:r>
+    </w:p>
+    <w:p>
+      <w:pPr>
+        <w:spacing w:after="120" w:before="0"/>
+        <w:ind w:left="431"/>
+        <w:jc w:val="both"/>
+      </w:pPr>
+      <w:r>
+        <w:rPr>
+          <w:rFonts w:ascii="Garamond" w:cs="Garamond" w:eastAsia="Garamond" w:hAnsi="Garamond"/>
+          <w:b w:val="false"/>
+          <w:bCs w:val="false"/>
+          <w:i w:val="false"/>
+          <w:iCs w:val="false"/>
+          <w:color w:val="2a2520"/>
+          <w:sz w:val="22"/>
+          <w:szCs w:val="22"/>
+        </w:rPr>
+        <w:t xml:space="preserve">Every person has the right to hold, practice, change, or decline any belief and to manifest it through worship, observance, practice, and teaching. No person may be compelled to participate in any religious observance contrary to their beliefs. Free exercise does not authorize harm to others and creates no exemption from laws protecting other enumerated rights.</w:t>
+      </w:r>
+    </w:p>
+    <w:p>
+      <w:pPr>
+        <w:spacing w:after="60" w:before="200"/>
+        <w:ind w:left="431"/>
+        <w:jc w:val="left"/>
+      </w:pPr>
+      <w:r>
+        <w:rPr>
+          <w:rFonts w:ascii="Courier New" w:cs="Courier New" w:eastAsia="Courier New" w:hAnsi="Courier New"/>
+          <w:b/>
+          <w:bCs/>
+          <w:color w:val="1B2A4A"/>
+          <w:sz w:val="18"/>
+          <w:szCs w:val="18"/>
+        </w:rPr>
+        <w:t xml:space="preserve">§1.6.a  </w:t>
       </w:r>
       <w:r>
         <w:rPr>
@@ -587,57 +638,6 @@
           <w:sz w:val="18"/>
           <w:szCs w:val="18"/>
         </w:rPr>
-        <w:t xml:space="preserve">§1.6  </w:t>
-      </w:r>
-      <w:r>
-        <w:rPr>
-          <w:rFonts w:ascii="Garamond" w:cs="Garamond" w:eastAsia="Garamond" w:hAnsi="Garamond"/>
-          <w:b/>
-          <w:bCs/>
-          <w:i w:val="false"/>
-          <w:iCs w:val="false"/>
-          <w:color w:val="1B2A4A"/>
-          <w:sz w:val="22"/>
-          <w:szCs w:val="22"/>
-        </w:rPr>
-        <w:t xml:space="preserve">Freedom of Thought, Conscience, and Religion</w:t>
-      </w:r>
-    </w:p>
-    <w:p>
-      <w:pPr>
-        <w:spacing w:after="120" w:before="0"/>
-        <w:ind w:left="431"/>
-        <w:jc w:val="both"/>
-      </w:pPr>
-      <w:r>
-        <w:rPr>
-          <w:rFonts w:ascii="Garamond" w:cs="Garamond" w:eastAsia="Garamond" w:hAnsi="Garamond"/>
-          <w:b w:val="false"/>
-          <w:bCs w:val="false"/>
-          <w:i w:val="false"/>
-          <w:iCs w:val="false"/>
-          <w:color w:val="2a2520"/>
-          <w:sz w:val="22"/>
-          <w:szCs w:val="22"/>
-        </w:rPr>
-        <w:t xml:space="preserve">Every person has the right to hold, practice, change, or decline any belief and to manifest it through worship, observance, practice, and teaching. No person may be compelled to participate in any religious observance contrary to their beliefs. Free exercise does not authorize harm to others and creates no exemption from laws protecting other enumerated rights.</w:t>
-      </w:r>
-    </w:p>
-    <w:p>
-      <w:pPr>
-        <w:spacing w:after="60" w:before="200"/>
-        <w:ind w:left="431"/>
-        <w:jc w:val="left"/>
-      </w:pPr>
-      <w:r>
-        <w:rPr>
-          <w:rFonts w:ascii="Courier New" w:cs="Courier New" w:eastAsia="Courier New" w:hAnsi="Courier New"/>
-          <w:b/>
-          <w:bCs/>
-          <w:color w:val="1B2A4A"/>
-          <w:sz w:val="18"/>
-          <w:szCs w:val="18"/>
-        </w:rPr>
         <w:t xml:space="preserve">§1.7  </w:t>
       </w:r>
       <w:r>
@@ -1181,7 +1181,7 @@
           <w:sz w:val="22"/>
           <w:szCs w:val="22"/>
         </w:rPr>
-        <w:t xml:space="preserve">The right to keep and bear arms for personal defense and hunting must not be infringed. States may establish proportionate licensing and safety requirements that do not function as effective prohibitions on lawful ownership. The burden of proof lies with the State to demonstrate that any challenged requirement is proportionate, non-discriminatory, and genuinely serves a safety purpose.</w:t>
+        <w:t xml:space="preserve">The right to keep and bear arms for personal defense and hunting must not be infringed. The scope and limits of this right are established in §1.12.a through §1.12.c.</w:t>
       </w:r>
     </w:p>
     <w:p>
@@ -2915,7 +2915,7 @@
           <w:sz w:val="22"/>
           <w:szCs w:val="22"/>
         </w:rPr>
-        <w:t xml:space="preserve">No government authority may use regulatory or land-use powers to exclude any person from housing on the basis of any characteristic enumerated in §1.9. Persons who cannot independently secure housing hold a constitutional entitlement to it through the Basic Needs Floor under §10.1.</w:t>
+        <w:t xml:space="preserve">Housing access is a constitutional right — no government authority may use its powers to exclude persons from housing on discriminatory grounds or to deny housing to those who cannot independently secure it. The non-exclusion principle is established in §1.25.a and the BNF housing obligation in §1.25.b.</w:t>
       </w:r>
     </w:p>
     <w:p>

</xml_diff>

<commit_message>
v172aj: Article IV focused review — 3 issues resolved
- §4.1.d: 'Three tracks:' colon-label replaced with operative opener
- §4.2.c: 'JI Certification —' label-dash stripped; 'Ministerial check,
  not a new assessment' editorial commentary removed; duplicate appeal
  right replaced with pointer to §8.4.i
- §4.2.f: 'Emergency Panel —' label-dash stripped
</commit_message>
<xml_diff>
--- a/constitution-v172.docx
+++ b/constitution-v172.docx
@@ -9524,7 +9524,7 @@
           <w:sz w:val="22"/>
           <w:szCs w:val="22"/>
         </w:rPr>
-        <w:t xml:space="preserve">Three tracks: legislative removal by 2/3 of both chambers for constitutional breach or demonstrated incapacity; judicial discipline through a process the Legislature establishes by statute, subject to SC oversight; and criminal conviction for disqualifying offenses. The EI must publish a factual finding before any legislative removal vote.</w:t>
+        <w:t xml:space="preserve">Inferior court judges may be removed through three tracks: legislative removal by 2/3 of both chambers for constitutional breach or demonstrated incapacity; judicial discipline through a process the Legislature establishes by statute, subject to SC oversight; and criminal conviction for disqualifying offenses. The EI must publish a factual finding before any legislative removal vote.</w:t>
       </w:r>
     </w:p>
     <w:p>
@@ -9728,7 +9728,7 @@
           <w:sz w:val="22"/>
           <w:szCs w:val="22"/>
         </w:rPr>
-        <w:t xml:space="preserve">JI Certification — the JI confirms that each candidate remains on the SC Candidate Registry and that no disqualifying change has occurred since Registry admission. Ministerial check, not a new assessment. Candidates who fail JI certification may appeal to an Appellate Court within 14 days.</w:t>
+        <w:t xml:space="preserve">The JI confirms that each candidate remains on the SC Candidate Registry and that no disqualifying change has occurred since Registry admission. Candidates who fail JI certification may appeal under §8.4.i.</w:t>
       </w:r>
     </w:p>
     <w:p>
@@ -9881,7 +9881,7 @@
           <w:sz w:val="22"/>
           <w:szCs w:val="22"/>
         </w:rPr>
-        <w:t xml:space="preserve">Emergency Panel — four justices drawn by rotation each 2-year cycle. Sole jurisdiction over constitutional challenges to Tier 1 presidential military authority during active operations. Must rule within 48 hours. Binding on the full Court unless overruled within 72 hours. Ensures SC oversight during active crisis without paralysis.</w:t>
+        <w:t xml:space="preserve">Four justices are drawn by rotation each 2-year cycle. Sole jurisdiction over constitutional challenges to Tier 1 presidential military authority during active operations. Must rule within 48 hours. Binding on the full Court unless overruled within 72 hours. Ensures SC oversight during active crisis without paralysis.</w:t>
       </w:r>
     </w:p>
     <w:p>

</xml_diff>

<commit_message>
v172ak: Article V focused review — 5 issues resolved
Editorial commentary stripped:
- §5.1.b: design rationale sentence removed
- §5.1.d: 'Years of service are a legitimate basis' removed
- §5.4.c: 'Deadlock cannot be weaponized' sentence removed

Redundancy resolved:
- §5.4.a: duplicate CLT floor prohibition removed — 'Any statute
  reducing the CLT below this floor is void' stated once

Table-of-contents replaced:
- §5.5: 'circumstances of ratification require a transitional grant'
  replaced with operative statement pointing to §5.5.a
</commit_message>
<xml_diff>
--- a/constitution-v172.docx
+++ b/constitution-v172.docx
@@ -11030,7 +11030,7 @@
           <w:sz w:val="22"/>
           <w:szCs w:val="22"/>
         </w:rPr>
-        <w:t xml:space="preserve">Children of citizens are Inhabitants at birth with full Article I protections. Full citizenship rights — including the right to vote — activate at 18. The distinction between Inhabitant and Citizen status for citizen children prevents citizenship from being used to exempt children from local law.</w:t>
+        <w:t xml:space="preserve">Children of citizens are Inhabitants at birth with full Article I protections. Full citizenship rights — including the right to vote — activate at 18.</w:t>
       </w:r>
     </w:p>
     <w:p>
@@ -11132,7 +11132,7 @@
           <w:sz w:val="22"/>
           <w:szCs w:val="22"/>
         </w:rPr>
-        <w:t xml:space="preserve">A Legal Resident may earn citizenship through honorable completion of military or national service — a service path that runs parallel to the residency path. Years of service are a legitimate basis for constitutional membership.</w:t>
+        <w:t xml:space="preserve">A Legal Resident may earn citizenship through honorable completion of military or national service — a service path that runs parallel to the residency path.</w:t>
       </w:r>
     </w:p>
     <w:p>
@@ -11489,7 +11489,7 @@
           <w:sz w:val="22"/>
           <w:szCs w:val="22"/>
         </w:rPr>
-        <w:t xml:space="preserve">The CLT must assess knowledge sufficient to understand the structure, powers, limits, and rights established by this Constitution. Any statute reducing the CLT below this floor is void and any citizen may challenge it in court. The Senate sets the CLT standard by statute — raising it by simple majority of both chambers. No statute may lower the CLT below the constitutional literacy floor established by this provision regardless of the majority used; any such statute is void and enforceable by any citizen in court. Compliance with the constitutional floor is enforced by courts on challenge. Where the CLT Administrator position is vacant, the Judicial Inspectorate administers the CLT on an interim basis using the most recently published test version until a new Administrator is confirmed by the Senate.</w:t>
+        <w:t xml:space="preserve">The CLT must assess knowledge sufficient to understand the structure, powers, limits, and rights established by this Constitution. Any statute reducing the CLT below this floor is void and any citizen may challenge it in court. The Senate sets the CLT standard by statute — raising it by simple majority of both chambers. Compliance with the constitutional floor is enforced by courts on challenge. Where the CLT Administrator position is vacant, the Judicial Inspectorate administers the CLT on an interim basis using the most recently published test version until a new Administrator is confirmed by the Senate.</w:t>
       </w:r>
     </w:p>
     <w:p>
@@ -11591,7 +11591,7 @@
           <w:sz w:val="22"/>
           <w:szCs w:val="22"/>
         </w:rPr>
-        <w:t xml:space="preserve">Senate deadlock on CLT standard changes keeps the existing version in force. Deadlock cannot be weaponized to eliminate the CLT or make it impossibly difficult — the existing test remains operative.</w:t>
+        <w:t xml:space="preserve">Senate deadlock on CLT standard changes keeps the existing version in force.</w:t>
       </w:r>
     </w:p>
     <w:p>
@@ -11642,7 +11642,7 @@
           <w:sz w:val="22"/>
           <w:szCs w:val="22"/>
         </w:rPr>
-        <w:t xml:space="preserve">The circumstances of ratification require a transitional citizenship grant for those who held voting rights at the moment of founding.</w:t>
+        <w:t xml:space="preserve">All individuals holding voting rights on Day Zero of ratification are automatically granted full citizenship as founding members of the Republic, as established in §5.5.a.</w:t>
       </w:r>
     </w:p>
     <w:p>

</xml_diff>

<commit_message>
v172al: Articles V + VI focused reviews — 9 issues resolved
Article V (5 issues):
- §5.1.b, §5.1.d: editorial design rationale sentences stripped
- §5.4.a: duplicate CLT floor prohibition removed
- §5.4.c: 'Deadlock cannot be weaponized' editorial stripped
- §5.5: table-of-contents replaced with operative statement

Article VI (4 issues):
- §6.1.b: 'Federal certification across' colon-label fixed
- §6.1.c: editorial 'The word ministerially is deliberate' stripped
- §6.1.d: 'Crucially:' editorial emphasis removed
- §6.3.a: 'Three-ground limitation channels challenges' editorial stripped
</commit_message>
<xml_diff>
--- a/constitution-v172.docx
+++ b/constitution-v172.docx
@@ -11873,7 +11873,7 @@
           <w:sz w:val="22"/>
           <w:szCs w:val="22"/>
         </w:rPr>
-        <w:t xml:space="preserve">Federal certification across four statutory categories: identity verification, criminal history, national security assessment, self-sufficiency or support guarantee. Cannot impose ideological screening or nationality-based quotas. Any denial must specify the precise ground in writing. National security denials published in redacted form protecting sources.</w:t>
+        <w:t xml:space="preserve">Federal certification covers four statutory categories: identity verification, criminal history, national security assessment, self-sufficiency or support guarantee. Cannot impose ideological screening or nationality-based quotas. Any denial must specify the precise ground in writing. National security denials published in redacted form protecting sources.</w:t>
       </w:r>
     </w:p>
     <w:p>
@@ -11924,7 +11924,7 @@
           <w:sz w:val="22"/>
           <w:szCs w:val="22"/>
         </w:rPr>
-        <w:t xml:space="preserve">Once an applicant clears both gates, the President must ministerially issue residency credentials. The word 'ministerially' is deliberate — the President has no discretion to refuse or delay what the law requires. Presidential interference with credential issuance is constitutionally prohibited.</w:t>
+        <w:t xml:space="preserve">Once an applicant clears both gates, the President must ministerially issue residency credentials. Presidential interference with credential issuance is constitutionally prohibited.</w:t>
       </w:r>
     </w:p>
     <w:p>
@@ -11975,7 +11975,7 @@
           <w:sz w:val="22"/>
           <w:szCs w:val="22"/>
         </w:rPr>
-        <w:t xml:space="preserve">The Legislature may establish a Federal Sponsorship Category where designated federal agencies serve as Gate 1 sponsors for applicants whose skills directly serve a defined federal interest — research programs, national infrastructure, national security-adjacent technical roles. The agency assumes all State Gate 1 responsibilities including notification obligations. Crucially: the Federal Sponsorship Category does not bypass Gate 2 — all four federal certification categories still apply. State Gate 1 authority is entirely unaffected; the federal category operates alongside, not instead of, State sponsorship.</w:t>
+        <w:t xml:space="preserve">The Legislature may establish a Federal Sponsorship Category where designated federal agencies serve as Gate 1 sponsors for applicants whose skills directly serve a defined federal interest — research programs, national infrastructure, national security-adjacent technical roles. The agency assumes all State Gate 1 responsibilities including notification obligations. The Federal Sponsorship Category does not bypass Gate 2 — all four federal certification categories still apply. State Gate 1 authority is entirely unaffected; the federal category operates alongside, not instead of, State sponsorship.</w:t>
       </w:r>
     </w:p>
     <w:p>
@@ -12128,7 +12128,7 @@
           <w:sz w:val="22"/>
           <w:szCs w:val="22"/>
         </w:rPr>
-        <w:t xml:space="preserve">An applicant may challenge a Gate 2 denial on three grounds: criterion outside the four certified categories; discriminatory application; or procedurally deficient process. Three-ground limitation channels challenges rather than eliminating them.</w:t>
+        <w:t xml:space="preserve">An applicant may challenge a Gate 2 denial on three grounds: criterion outside the four certified categories; discriminatory application; or procedurally deficient process.</w:t>
       </w:r>
     </w:p>
     <w:p>

</xml_diff>

<commit_message>
v172am: Article VII focused review — 5 issues resolved
Editorial commentary stripped:
- §7.2.f: 'The runoff closes the edge-case gap' removed
- §7.2.c.i: 'No State infrastructure is required —' framing removed;
  operative content kept
- §7.2.d: editorial last sentence removed
- §7.3.a: '§1.26.e backs this up' cross-reference commentary removed

Undefined term fixed:
- §7.2.e: 'the constitutionally fixed moment' → 'the moment established
  by the transition provisions of §19.3'
</commit_message>
<xml_diff>
--- a/constitution-v172.docx
+++ b/constitution-v172.docx
@@ -12971,7 +12971,7 @@
           <w:sz w:val="22"/>
           <w:szCs w:val="22"/>
         </w:rPr>
-        <w:t xml:space="preserve">Each State maintains a standing Regional Boundary Pool for each redistricting cycle. Any person may be placed into a State's Pool through the State's own constitutional or statutory process, provided they meet three eligibility requirements at the time of entry: at least five continuous years of Republic citizenship; at least five continuous years of residency in the State whose Pool they are entering; and no current elected office. The LI certifies eligibility before entry — ministerially, not selectively. States determine through their own process how candidates are nominated from among those eligible. An entrant who takes elected office after entering the Pool is ineligible to be drawn for so long as they hold that office; if drawn while in elected office, the JI draws a replacement from the same State's eligible Pool. The LI maintains each State's Pool as a public record on the NRS. No State infrastructure is required — States need only submit names to the LI for certification and pay their drawn representative during commission service.</w:t>
+        <w:t xml:space="preserve">Each State maintains a standing Regional Boundary Pool for each redistricting cycle. Any person may be placed into a State's Pool through the State's own constitutional or statutory process, provided they meet three eligibility requirements at the time of entry: at least five continuous years of Republic citizenship; at least five continuous years of residency in the State whose Pool they are entering; and no current elected office. The LI certifies eligibility before entry — ministerially, not selectively. States determine through their own process how candidates are nominated from among those eligible. An entrant who takes elected office after entering the Pool is ineligible to be drawn for so long as they hold that office; if drawn while in elected office, the JI draws a replacement from the same State's eligible Pool. The LI maintains each State's Pool as a public record on the NRS. States need only submit names to the LI for certification and pay their drawn representative during commission service.</w:t>
       </w:r>
     </w:p>
     <w:p>
@@ -13481,7 +13481,7 @@
           <w:sz w:val="22"/>
           <w:szCs w:val="22"/>
         </w:rPr>
-        <w:t xml:space="preserve">Territory citizens hold the full §1.20 right to vote in presidential elections. Their votes count in the national first-preference total — the 65% component of the combined score — but Territories are not assigned to presidential election regions and do not contribute to the 35% regional breadth component. The regional breadth measure reflects the geographic distribution of the Republic's State structure. Territory citizens participate fully in the national democratic mandate; they do not give Territories a footprint in the regional component that States earn through the Statehood process.</w:t>
+        <w:t xml:space="preserve">Territory citizens hold the full §1.20 right to vote in presidential elections. Their votes count in the national first-preference total — the 65% component of the combined score — but Territories are not assigned to presidential election regions and do not contribute to the 35% regional breadth component. The regional breadth measure reflects the geographic distribution of the Republic's State structure.</w:t>
       </w:r>
     </w:p>
     <w:p>
@@ -13532,7 +13532,7 @@
           <w:sz w:val="22"/>
           <w:szCs w:val="22"/>
         </w:rPr>
-        <w:t xml:space="preserve">The Electoral Commission certifies the final presidential election result to the NRS within a period the Legislature defines by statute. Certification is final and may be challenged only before the Supreme Court within 14 days. No transfer of presidential authority may be delayed beyond the constitutionally fixed moment.</w:t>
+        <w:t xml:space="preserve">The Electoral Commission certifies the final presidential election result to the NRS within a period the Legislature defines by statute. Certification is final and may be challenged only before the Supreme Court within 14 days. No transfer of presidential authority may be delayed beyond the moment established by the transition provisions of §19.3.</w:t>
       </w:r>
     </w:p>
     <w:p>
@@ -13583,7 +13583,7 @@
           <w:sz w:val="22"/>
           <w:szCs w:val="22"/>
         </w:rPr>
-        <w:t xml:space="preserve">If two candidates are within 0.5 percentage points of each other on the final combined score as calculated under §7.2.b, a head-to-head national RCV runoff is conducted between those two candidates. The runoff closes the edge-case gap where the combined score is mathematically indeterminate.</w:t>
+        <w:t xml:space="preserve">If two candidates are within 0.5 percentage points of each other on the final combined score as calculated under §7.2.b, a head-to-head national RCV runoff is conducted between those two candidates.</w:t>
       </w:r>
     </w:p>
     <w:p>
@@ -13685,7 +13685,7 @@
           <w:sz w:val="22"/>
           <w:szCs w:val="22"/>
         </w:rPr>
-        <w:t xml:space="preserve">The President may not declare, postpone, or influence the scheduling of elections — including declaring emergencies that have the effect of postponing them. §1.26.e's prohibition on emergency-based election postponement backs this up: even a genuine emergency cannot defer a scheduled election.</w:t>
+        <w:t xml:space="preserve">The President may not declare, postpone, or influence the scheduling of elections — including declaring emergencies that have the effect of postponing them.</w:t>
       </w:r>
     </w:p>
     <w:p>

</xml_diff>

<commit_message>
v172an: Article XI focused review — 3 issues resolved
- §11.1.c: 'Referendum Outcome —' label-dash stripped
- §11.2: 'process and thresholds established in §11.2.a' table-of-
  contents sentence removed
- §11.2.a: 'Distinct from the referendum...' restatement stripped;
  provision now opens directly with the operative threshold

Note: §11.3 Local Government is topically misplaced in the Direct
Democracy article; belongs more naturally in Article XIII or XVII.
No structural change made — renumbering cost exceeds benefit.
</commit_message>
<xml_diff>
--- a/constitution-v172.docx
+++ b/constitution-v172.docx
@@ -20015,7 +20015,7 @@
           <w:sz w:val="22"/>
           <w:szCs w:val="22"/>
         </w:rPr>
-        <w:t xml:space="preserve">Referendum Outcome — if the referendum passes (simple majority of votes cast, subject to the Legislature-defined turnout threshold), the law is repealed immediately upon EC certification. If it fails, the law remains in effect and cannot be subjected to referendum on the same grounds for 5 years. The Legislature may re-enact a repealed law, but the re-enacted version is again subject to referendum.</w:t>
+        <w:t xml:space="preserve">If the referendum passes (simple majority of votes cast, subject to the Legislature-defined turnout threshold), the law is repealed immediately upon EC certification. If it fails, the law remains in effect and cannot be subjected to referendum on the same grounds for 5 years. The Legislature may re-enact a repealed law, but the re-enacted version is again subject to referendum.</w:t>
       </w:r>
     </w:p>
     <w:p>
@@ -20066,7 +20066,7 @@
           <w:sz w:val="22"/>
           <w:szCs w:val="22"/>
         </w:rPr>
-        <w:t xml:space="preserve">Citizens hold the right to propose legislation directly to the Legislature through the initiative mechanism. The initiative is distinct from the referendum — it creates new law rather than repealing enacted law. The process and thresholds are established in §11.2.a.</w:t>
+        <w:t xml:space="preserve">Citizens hold the right to propose legislation directly to the Legislature through the initiative mechanism. The initiative is distinct from the referendum — it creates new law rather than repealing enacted law.</w:t>
       </w:r>
     </w:p>
     <w:p>
@@ -20117,7 +20117,7 @@
           <w:sz w:val="22"/>
           <w:szCs w:val="22"/>
         </w:rPr>
-        <w:t xml:space="preserve">Distinct from the referendum, the initiative allows citizens to propose legislation directly. 10% of eligible voters petition for a specific legislative proposal. The Legislature must vote on the proposal within 90 days. If it fails or is not voted on, the proposal proceeds to a national referendum at the §15.1.c thresholds — citizen-initiated legislation that bypasses the Legislature requires a higher democratic mandate than simple repeal.</w:t>
+        <w:t xml:space="preserve">10% of eligible voters petition for a specific legislative proposal. The Legislature must vote on the proposal within 90 days. If it fails or is not voted on, the proposal proceeds to a national referendum at the §15.1.c thresholds — citizen-initiated legislation that bypasses the Legislature requires a higher democratic mandate than simple repeal.</w:t>
       </w:r>
     </w:p>
     <w:p>

</xml_diff>

<commit_message>
v172ao: Articles XI + XIII focused reviews — 10 issues resolved
Article XI (3 issues):
- §11.1.c: 'Referendum Outcome —' label-dash stripped
- §11.2: table-of-contents last sentence removed
- §11.2.a: 'Distinct from the referendum' restatement stripped

Article XIII (7 issues):
- §13.1: CRITICAL — internal contradiction removed; stale 'non-voting
  delegates' sentence directly contradicted current full-voting-member
  status established in v172t; contradictory sentence removed
- §13.2: 'automatic nature is intentional' editorial sentence stripped
- §13.2.a: 'Statehood Audit — Fiscal Integrity Criterion' label-dash
  stripped
- §13.2.b: 'Statehood Audit — Article I Legal Compliance Criterion'
  label-dash stripped
- §13.3: 'Not punishment — constitutional alternative' editorial
  stripped
- §13.4.d: 'Post-Devolution Status —' label-dash stripped
- §13.6: 'initiation must be an unencumbered democratic act' editorial
  sentence stripped; operative prohibition retained
</commit_message>
<xml_diff>
--- a/constitution-v172.docx
+++ b/constitution-v172.docx
@@ -20987,7 +20987,7 @@
           <w:sz w:val="22"/>
           <w:szCs w:val="22"/>
         </w:rPr>
-        <w:t xml:space="preserve">The foundational category for non-State jurisdictions within the Republic. A Territory operates under a Territorial Compact, has federal protections under Article I, receives BNF benefits, and may begin the Statehood pathway under §13.2. Territories are represented in the House by non-voting delegates who may participate in debate and committee work. Territories hold House seats proportional to their population under §3.1.a and participate in the House as full voting members. Territories do not hold Senate seats; Senate representation is reserved for States.</w:t>
+        <w:t xml:space="preserve">The foundational category for non-State jurisdictions within the Republic. A Territory operates under a Territorial Compact, has federal protections under Article I, receives BNF benefits, and may begin the Statehood pathway under §13.2. Territories hold House seats proportional to their population under §3.1.a and participate in the House as full voting members. Territories do not hold Senate seats; Senate representation is reserved for States.</w:t>
       </w:r>
     </w:p>
     <w:p>
@@ -21038,7 +21038,7 @@
           <w:sz w:val="22"/>
           <w:szCs w:val="22"/>
         </w:rPr>
-        <w:t xml:space="preserve">The pathway from Territory to State is automatic upon successfully completing the Statehood Audit and Provisional Membership Period. No political vote in Congress is required once the audit is passed — statehood is a constitutional entitlement for any Territory that meets the criteria, not a political grant. The automatic nature of this pathway is intentional — statehood is a constitutional right of a qualifying jurisdiction, not a political favor to be granted or withheld by incumbent States.</w:t>
+        <w:t xml:space="preserve">The pathway from Territory to State is automatic upon successfully completing the Statehood Audit and Provisional Membership Period. No political vote in Congress is required once the audit is passed — statehood is a constitutional entitlement for any Territory that meets the criteria, not a political grant.</w:t>
       </w:r>
     </w:p>
     <w:p>
@@ -21089,7 +21089,7 @@
           <w:sz w:val="22"/>
           <w:szCs w:val="22"/>
         </w:rPr>
-        <w:t xml:space="preserve">Statehood Audit — Fiscal Integrity Criterion. The LI audits the territory's government finances for basic fiscal sustainability, absence of structural insolvency that would require federal bailout, and basic public financial management standards. The audit checks whether the territory can function as a financially independent State — not whether its fiscal policy is optimal.</w:t>
+        <w:t xml:space="preserve">The LI audits the territory's government finances for basic fiscal sustainability, absence of structural insolvency that would require federal bailout, and basic public financial management standards. The audit checks whether the territory can function as a financially independent State — not whether its fiscal policy is optimal.</w:t>
       </w:r>
     </w:p>
     <w:p>
@@ -21140,7 +21140,7 @@
           <w:sz w:val="22"/>
           <w:szCs w:val="22"/>
         </w:rPr>
-        <w:t xml:space="preserve">Statehood Audit — Article I Legal Compliance Criterion. The JI audits the territory's legal system for compliance with every Article I right. Statehood is not granted to jurisdictions that are constitutionally non-compliant — a territory that applies Article I rights inconsistently cannot become a State while those violations persist.</w:t>
+        <w:t xml:space="preserve">The JI audits the territory's legal system for compliance with every Article I right. Statehood is not granted to jurisdictions that are constitutionally non-compliant — a territory that applies Article I rights inconsistently cannot become a State while those violations persist.</w:t>
       </w:r>
     </w:p>
     <w:p>
@@ -21650,7 +21650,7 @@
           <w:sz w:val="22"/>
           <w:szCs w:val="22"/>
         </w:rPr>
-        <w:t xml:space="preserve">The remedial process for States that have failed to meet minimum governance standards over a sustained period. Not punishment — a constitutional alternative to indefinite dysfunction. The path back to full Statehood is always available. Devolution restructures the State's relationship with the federal government while preserving its constitutional status.</w:t>
+        <w:t xml:space="preserve">The remedial process for States that have failed to meet minimum governance standards over a sustained period. Devolution restructures the State's relationship with the federal government while preserving its constitutional status.</w:t>
       </w:r>
     </w:p>
     <w:p>
@@ -22160,7 +22160,7 @@
           <w:sz w:val="22"/>
           <w:szCs w:val="22"/>
         </w:rPr>
-        <w:t xml:space="preserve">Post-Devolution Status — following voluntary devolution, successor jurisdiction(s) begin their constitutional status from the starting point specified in the restructuring agreement. A subdivision that becomes a Territory enters the Statehood pathway immediately.</w:t>
+        <w:t xml:space="preserve">Following voluntary devolution, successor jurisdiction(s) begin their constitutional status from the starting point specified in the restructuring agreement. A subdivision that becomes a Territory enters the Statehood pathway immediately.</w:t>
       </w:r>
     </w:p>
     <w:p>
@@ -22364,7 +22364,7 @@
           <w:sz w:val="22"/>
           <w:szCs w:val="22"/>
         </w:rPr>
-        <w:t xml:space="preserve">A sovereign entity may petition to join the Republic's constitutional framework as a Territory. The process requires: a petition resolution adopted by the petitioning entity's own legislature or assembly by a 2/3 majority, confirmed by a citizen referendum achieving simple majority approval on a minimum 50% participation threshold — both are required; the Judicial Inspectorate's assessment of whether the entity systematically violates any unamendable Article I provision, published to the NRS within 90 days of petition receipt; and acceptance by the Legislature by a 2/3 majority of both chambers. If the Legislature declines it must publish its reasons to the NRS within 30 days. An accepted petition produces an incorporation agreement specifying a transition period not exceeding 48 months, the institutional adjustments required to meet §13.2.f, and the federal support framework. The incorporated entity immediately holds all Territory protections under §13.1. The Republic may not compel, incentivise, or pressure any sovereign entity to initiate this process — initiation must be an unencumbered democratic act of the petitioning entity's own governance. An indigenous nation recognised under Article XIV that wishes to pursue territorial incorporation must first make a status election through §14.6 before this provision applies.</w:t>
+        <w:t xml:space="preserve">A sovereign entity may petition to join the Republic's constitutional framework as a Territory. The process requires: a petition resolution adopted by the petitioning entity's own legislature or assembly by a 2/3 majority, confirmed by a citizen referendum achieving simple majority approval on a minimum 50% participation threshold — both are required; the Judicial Inspectorate's assessment of whether the entity systematically violates any unamendable Article I provision, published to the NRS within 90 days of petition receipt; and acceptance by the Legislature by a 2/3 majority of both chambers. If the Legislature declines it must publish its reasons to the NRS within 30 days. An accepted petition produces an incorporation agreement specifying a transition period not exceeding 48 months, the institutional adjustments required to meet §13.2.f, and the federal support framework. The incorporated entity immediately holds all Territory protections under §13.1. The Republic may not compel, incentivise, or pressure any sovereign entity to initiate this process. An indigenous nation recognised under Article XIV that wishes to pursue territorial incorporation must first make a status election through §14.6 before this provision applies.</w:t>
       </w:r>
     </w:p>
     <w:p>

</xml_diff>

<commit_message>
v172ap: Article XV focused review — 4 issues resolved
- §15.1.a: 'Legislative Amendment.' label stripped
- §15.1.b: 'Path B — Legislative and Popular Amendment.' label stripped
- §15.3.a: 'The Unamendable Floor —' label stripped
- §15.4: editorial 'No government may cede territory' sentence stripped;
  operative consent requirement retained
- §15.6: 'Constitutional Supremacy —' label-dash stripped
</commit_message>
<xml_diff>
--- a/constitution-v172.docx
+++ b/constitution-v172.docx
@@ -23897,7 +23897,7 @@
           <w:sz w:val="22"/>
           <w:szCs w:val="22"/>
         </w:rPr>
-        <w:t xml:space="preserve">Legislative Amendment. Requires 3/4 supermajority of the full seated membership of both chambers in a single concurrent vote. No popular referendum. No executive signature. Every member's vote is published to the NRS within 24 hours. The 3/4 threshold is the highest legislative supermajority in the constitution — near-unanimous legislative agreement required.</w:t>
+        <w:t xml:space="preserve">Requires 3/4 supermajority of the full seated membership of both chambers in a single concurrent vote. No popular referendum. No executive signature. Every member's vote is published to the NRS within 24 hours. The 3/4 threshold is the highest legislative supermajority in the constitution — near-unanimous legislative agreement required.</w:t>
       </w:r>
     </w:p>
     <w:p>
@@ -23948,7 +23948,7 @@
           <w:sz w:val="22"/>
           <w:szCs w:val="22"/>
         </w:rPr>
-        <w:t xml:space="preserve">Path B — Legislative and Popular Amendment. Lower legislative threshold (2/3 both chambers) but requires the People to ratify. National popular vote within 180 days of the parliamentary vote. 55% affirmative support with at least 55% citizen participation required. EC and LI certify jointly. Neither stage alone is sufficient.</w:t>
+        <w:t xml:space="preserve">Lower legislative threshold (2/3 both chambers) but requires the People to ratify. National popular vote within 180 days of the parliamentary vote. 55% affirmative support with at least 55% citizen participation required. EC and LI certify jointly. Neither stage alone is sufficient.</w:t>
       </w:r>
     </w:p>
     <w:p>
@@ -24203,7 +24203,7 @@
           <w:sz w:val="22"/>
           <w:szCs w:val="22"/>
         </w:rPr>
-        <w:t xml:space="preserve">The Unamendable Floor — six provisions that cannot be amended by any process: §1.3 (torture prohibition), §1.4 (slavery and forced labor), §1.14 (habeas corpus), §1.18 (public trial), §1.19 (no retroactive criminal laws), §1.28 (non-refoulement). Article I as a whole can only expand — no amendment may reduce any Article I right below its current floor.</w:t>
+        <w:t xml:space="preserve">Six provisions that cannot be amended by any process: §1.3 (torture prohibition), §1.4 (slavery and forced labor), §1.14 (habeas corpus), §1.18 (public trial), §1.19 (no retroactive criminal laws), §1.28 (non-refoulement). Article I as a whole can only expand — no amendment may reduce any Article I right below its current floor.</w:t>
       </w:r>
     </w:p>
     <w:p>
@@ -24713,7 +24713,7 @@
           <w:sz w:val="22"/>
           <w:szCs w:val="22"/>
         </w:rPr>
-        <w:t xml:space="preserve">Constitutional Supremacy — this Constitution is the supreme law of the Federated Republic. All legislative acts, executive orders, treaties, administrative decisions, and government actions must be consistent with this Constitution. Any provision inconsistent with this Constitution is void to the extent of the inconsistency.</w:t>
+        <w:t xml:space="preserve">This Constitution is the supreme law of the Federated Republic. All legislative acts, executive orders, treaties, administrative decisions, and government actions must be consistent with this Constitution. Any provision inconsistent with this Constitution is void to the extent of the inconsistency.</w:t>
       </w:r>
     </w:p>
     <w:p>

</xml_diff>

<commit_message>
v172aq: Articles XV + XVI focused reviews — 8 issues resolved
Article XV (4 issues):
- §15.1.a: 'Legislative Amendment.' label stripped
- §15.1.b: 'Path B —' label stripped
- §15.3.a: 'The Unamendable Floor —' label stripped
- §15.4: editorial cede-territory sentence stripped
- §15.6: 'Constitutional Supremacy —' label stripped

Article XVI (4 issues):
- §16.5: table-of-contents second sentence removed
- §16.5.a: editorial capture-sentence stripped
- §16.5.c: 'Critically:' editorial emphasis removed
- §16.7: editorial NVS ratification sentence stripped
</commit_message>
<xml_diff>
--- a/constitution-v172.docx
+++ b/constitution-v172.docx
@@ -25454,7 +25454,7 @@
           <w:sz w:val="22"/>
           <w:szCs w:val="22"/>
         </w:rPr>
-        <w:t xml:space="preserve">The Electoral Commission's independence does not place it above accountability. This section governs its funding, Inspectorate oversight, removal of members for cause, and vacancy procedures.</w:t>
+        <w:t xml:space="preserve">The Electoral Commission's independence does not place it above accountability.</w:t>
       </w:r>
     </w:p>
     <w:p>
@@ -25505,7 +25505,7 @@
           <w:sz w:val="22"/>
           <w:szCs w:val="22"/>
         </w:rPr>
-        <w:t xml:space="preserve">Campaigns for Electoral Commission seats are publicly funded in full. No private money may be spent on EC campaigns. The EC administers elections for all other offices — it cannot itself be captured by the interests that it would regulate in other campaigns.</w:t>
+        <w:t xml:space="preserve">Campaigns for Electoral Commission seats are publicly funded in full. No private money may be spent on EC campaigns.</w:t>
       </w:r>
     </w:p>
     <w:p>
@@ -25607,7 +25607,7 @@
           <w:sz w:val="22"/>
           <w:szCs w:val="22"/>
         </w:rPr>
-        <w:t xml:space="preserve">For-cause only, 2/3 both chambers simultaneously, preceded by State Designee Panel verification. 180-day election proximity rule: any removal vote within 180 days of a major national election is automatically suspended pending SC review within 48 hours. Critically: the proximity restriction applies to the removal vote only — Panel-triggered suspension of duties under §16.2.a is not subject to the proximity window.</w:t>
+        <w:t xml:space="preserve">For-cause only, 2/3 both chambers simultaneously, preceded by State Designee Panel verification. 180-day election proximity rule: any removal vote within 180 days of a major national election is automatically suspended pending SC review within 48 hours. The proximity restriction applies to the removal vote only — Panel-triggered suspension of duties under §16.2.a is not subject to the proximity window.</w:t>
       </w:r>
     </w:p>
     <w:p>
@@ -25760,7 +25760,7 @@
           <w:sz w:val="22"/>
           <w:szCs w:val="22"/>
         </w:rPr>
-        <w:t xml:space="preserve">Legislature must establish by statute the transition from any predecessor voting infrastructure to the constitutionally required NVS. The statute must ensure continuity of democratic participation — no gap between the predecessor system going offline and the NVS coming online. The ratification vote itself was conducted on the NVS (§19.1).</w:t>
+        <w:t xml:space="preserve">Legislature must establish by statute the transition from any predecessor voting infrastructure to the constitutionally required NVS. The statute must ensure continuity of democratic participation — no gap between the predecessor system going offline and the NVS coming online.</w:t>
       </w:r>
     </w:p>
     <w:p>

</xml_diff>

<commit_message>
v172ar: Article XVII focused review — 4 issues resolved
- §17.3: 'This section governs registration...' table-of-contents stripped
- §17.4: 'preventing privatization by executive discretion' and
  'insulating land management from PM pressure' editorial phrases stripped
- §17.4.f: 'Prevents executive land grabs' editorial sentence stripped
- §17.4.g: ghost §3.7 cross-reference fixed (third occurrence, after
  §9.3 and §2.2.b) — replaced with 'whose independence is protected
  by statute'
</commit_message>
<xml_diff>
--- a/constitution-v172.docx
+++ b/constitution-v172.docx
@@ -26246,7 +26246,7 @@
           <w:sz w:val="22"/>
           <w:szCs w:val="22"/>
         </w:rPr>
-        <w:t xml:space="preserve">The federal government holds property interests within States through Operational Use Rights rather than fee ownership. This section governs registration, termination, improvements, and the rights of residents within federal use footprints.</w:t>
+        <w:t xml:space="preserve">The federal government holds property interests within States through Operational Use Rights rather than fee ownership.</w:t>
       </w:r>
     </w:p>
     <w:p>
@@ -26552,7 +26552,7 @@
           <w:sz w:val="22"/>
           <w:szCs w:val="22"/>
         </w:rPr>
-        <w:t xml:space="preserve">The National Trust holds all federal land not conveyed by statute to States, indigenous compact territories, or private parties. Land disposal requires statute — the executive cannot convey or encumber public land unilaterally, preventing privatization by executive discretion. The National Trust Administrator is independently confirmed under the §2.2.h escalation framework, insulating land management from PM pressure. The Trust is structurally distinct from the Community Land Trust: the NTA manages federal holdings; the CLT Administrator manages affordable residential land held in trust for Inhabitants.</w:t>
+        <w:t xml:space="preserve">The National Trust holds all federal land not conveyed by statute to States, indigenous compact territories, or private parties. Land disposal requires statute — the executive cannot convey or encumber public land unilaterally. The National Trust Administrator is independently confirmed under the §2.2.h escalation framework. The Trust is structurally distinct from the Community Land Trust: the NTA manages federal holdings; the CLT Administrator manages affordable residential land held in trust for Inhabitants.</w:t>
       </w:r>
     </w:p>
     <w:p>
@@ -26858,7 +26858,7 @@
           <w:sz w:val="22"/>
           <w:szCs w:val="22"/>
         </w:rPr>
-        <w:t xml:space="preserve">Land may be designated National Trust by a 2/3 vote of both chambers with host State consent (land in Territories: 2/3 vote alone). No executive action may designate Trust lands — designation is a legislative act. Prevents executive land grabs under Trust designation and executive stripping of Trust status.</w:t>
+        <w:t xml:space="preserve">Land may be designated National Trust by a 2/3 vote of both chambers with host State consent (land in Territories: 2/3 vote alone). No executive action may designate Trust lands — designation is a legislative act.</w:t>
       </w:r>
     </w:p>
     <w:p>
@@ -26909,7 +26909,7 @@
           <w:sz w:val="22"/>
           <w:szCs w:val="22"/>
         </w:rPr>
-        <w:t xml:space="preserve">The National Trust Administrator is a statutory independent officer under §3.7. The Legislature creates the office by statute and establishes the Administrator's independence, term, and removal grounds through the enabling statute. The enabling statute may not reduce the stewardship obligations established in §17.4.a–f or diminish the EI's annual monitoring authority.</w:t>
+        <w:t xml:space="preserve">The National Trust Administrator is a statutory independent officer whose independence is protected by statute. The Legislature creates the office by statute and establishes the Administrator's independence, term, and removal grounds through the enabling statute. The enabling statute may not reduce the stewardship obligations established in §17.4.a–f or diminish the EI's annual monitoring authority.</w:t>
       </w:r>
     </w:p>
     <w:p>

</xml_diff>

<commit_message>
v172as: Article XVIII focused review — 4 issues resolved
- §18.1.a: 'Electoral Finance Disclosure —' label-dash stripped
- §18.1.b: 'Contribution Limits —' label-dash stripped
- §18.1.c: 'Independent Expenditure Disclosure —' label-dash stripped
- §18.1.d: 'EC Administration —' label-dash stripped
</commit_message>
<xml_diff>
--- a/constitution-v172.docx
+++ b/constitution-v172.docx
@@ -27089,7 +27089,7 @@
           <w:sz w:val="22"/>
           <w:szCs w:val="22"/>
         </w:rPr>
-        <w:t xml:space="preserve">Electoral Finance Disclosure — all contributions above the de minimis threshold must be publicly disclosed to the Electoral Commission and published to the NRS. Anonymity in electoral finance is prohibited. The de minimis threshold may not be set so high that it effectively permits anonymous large-scale contributions.</w:t>
+        <w:t xml:space="preserve">All contributions above the de minimis threshold must be publicly disclosed to the Electoral Commission and published to the NRS. Anonymity in electoral finance is prohibited. The de minimis threshold may not be set so high that it effectively permits anonymous large-scale contributions.</w:t>
       </w:r>
     </w:p>
     <w:p>
@@ -27140,7 +27140,7 @@
           <w:sz w:val="22"/>
           <w:szCs w:val="22"/>
         </w:rPr>
-        <w:t xml:space="preserve">Contribution Limits — individual contributions to electoral campaigns are capped at a level defined by statute. Corporate, organizational, and foreign contributions are prohibited. The prohibition on foreign contributions applies to any person or entity that is not a Republic citizen or resident.</w:t>
+        <w:t xml:space="preserve">Individual contributions to electoral campaigns are capped at a level defined by statute. Corporate, organizational, and foreign contributions are prohibited. The prohibition on foreign contributions applies to any person or entity that is not a Republic citizen or resident.</w:t>
       </w:r>
     </w:p>
     <w:p>
@@ -27191,7 +27191,7 @@
           <w:sz w:val="22"/>
           <w:szCs w:val="22"/>
         </w:rPr>
-        <w:t xml:space="preserve">Independent Expenditure Disclosure — expenditures made independently of but in support of a campaign must also be disclosed. Independent expenditures are not subject to the same contribution limits as direct contributions, but are subject to the same disclosure requirements. Coordinated expenditures are treated as direct contributions.</w:t>
+        <w:t xml:space="preserve">Expenditures made independently of but in support of a campaign must also be disclosed. Independent expenditures are not subject to the same contribution limits as direct contributions, but are subject to the same disclosure requirements. Coordinated expenditures are treated as direct contributions.</w:t>
       </w:r>
     </w:p>
     <w:p>
@@ -27242,7 +27242,7 @@
           <w:sz w:val="22"/>
           <w:szCs w:val="22"/>
         </w:rPr>
-        <w:t xml:space="preserve">EC Administration — the Electoral Commission administers all electoral finance rules, reviews all disclosed contributions, publishes all disclosures to the NRS, and investigates suspected violations. The EI audits EC administration annually. Candidates who receive impermissible contributions must report them within 10 days and either return them or have them treated as undisclosed.</w:t>
+        <w:t xml:space="preserve">The Electoral Commission administers all electoral finance rules, reviews all disclosed contributions, publishes all disclosures to the NRS, and investigates suspected violations. The EI audits EC administration annually. Candidates who receive impermissible contributions must report them within 10 days and either return them or have them treated as undisclosed.</w:t>
       </w:r>
     </w:p>
     <w:p>

</xml_diff>